<commit_message>
Give the article one white page template, for good
Every page, in the PDF, on the site and in Word, is white and built from the
same four slots in the same place: a square image (golden-ratio width) top
right, a side column with number, title, label and key sentence, two text
columns, and a full-width graphic band. One item per page; no dark pages,
no black bands, no frames. Three new chapter images and a square cover crop.
The PDF check now also catches text that spills out of its slot, and the
e2e test checks that every web section shares the template.

Co-Authored-By: Claude Opus 5.5 <noreply@anthropic.com>
Claude-Session: https://claude.ai/code/session_017XCpuEgzrjyP4rAvwPMzjL
</commit_message>
<xml_diff>
--- a/datasong-article.docx
+++ b/datasong-article.docx
@@ -5,11 +5,12 @@
     <w:p>
       <w:pPr>
         <w:bidi/>
+        <w:spacing w:after="80"/>
       </w:pPr>
       <w:r>
         <w:drawing>
           <wp:inline xmlns:a="http://schemas.openxmlformats.org/drawingml/2006/main" xmlns:pic="http://schemas.openxmlformats.org/drawingml/2006/picture">
-            <wp:extent cx="6696000" cy="3766500"/>
+            <wp:extent cx="4032000" cy="4032000"/>
             <wp:docPr id="1" name="Picture 1"/>
             <wp:cNvGraphicFramePr>
               <a:graphicFrameLocks noChangeAspect="1"/>
@@ -18,7 +19,7 @@
               <a:graphicData uri="http://schemas.openxmlformats.org/drawingml/2006/picture">
                 <pic:pic>
                   <pic:nvPicPr>
-                    <pic:cNvPr id="0" name="hero.jpg"/>
+                    <pic:cNvPr id="0" name="hero-sq.jpg"/>
                     <pic:cNvPicPr/>
                   </pic:nvPicPr>
                   <pic:blipFill>
@@ -30,7 +31,7 @@
                   <pic:spPr>
                     <a:xfrm>
                       <a:off x="0" y="0"/>
-                      <a:ext cx="6696000" cy="3766500"/>
+                      <a:ext cx="4032000" cy="4032000"/>
                     </a:xfrm>
                     <a:prstGeom prst="rect"/>
                   </pic:spPr>
@@ -44,7 +45,7 @@
     <w:p>
       <w:pPr>
         <w:bidi/>
-        <w:spacing w:after="160"/>
+        <w:spacing w:after="120"/>
       </w:pPr>
       <w:r>
         <w:rPr>
@@ -88,9 +89,9 @@
           <w:b w:val="0"/>
           <w:i w:val="0"/>
           <w:color w:val="111111"/>
-          <w:sz w:val="60"/>
+          <w:sz w:val="56"/>
           <w:rtl/>
-          <w:szCs w:val="60"/>
+          <w:szCs w:val="56"/>
         </w:rPr>
         <w:t>מוזיקה שקפאה,</w:t>
       </w:r>
@@ -106,10 +107,10 @@
           <w:b/>
           <w:i w:val="0"/>
           <w:color w:val="111111"/>
-          <w:sz w:val="60"/>
+          <w:sz w:val="56"/>
           <w:rtl/>
           <w:bCs/>
-          <w:szCs w:val="60"/>
+          <w:szCs w:val="56"/>
         </w:rPr>
         <w:t>נתונים שהופשרו</w:t>
       </w:r>
@@ -117,7 +118,7 @@
     <w:p>
       <w:pPr>
         <w:bidi/>
-        <w:spacing w:after="160"/>
+        <w:spacing w:after="80"/>
       </w:pPr>
       <w:r>
         <w:rPr>
@@ -125,9 +126,9 @@
           <w:b w:val="0"/>
           <w:i w:val="0"/>
           <w:color w:val="111111"/>
-          <w:sz w:val="22"/>
+          <w:sz w:val="21"/>
           <w:rtl/>
-          <w:szCs w:val="22"/>
+          <w:szCs w:val="21"/>
         </w:rPr>
         <w:t>המשפט על אדריכלות כמוזיקה שקפאה נאמר לפני כמעט מאתיים שנה כמטאפורה. DataSong לוקחת אותו מילולית ומריצה אותו בשני הכיוונים: סדרה אחת של מספרים מעולם התכנון נשמעת כיצירה בארבע שכבות, נבנית כשרטוט, ומתפרשת כדימוי אדריכלי. שמונה יצירות מראות מה מתגלה כשאותם נתונים חייבים להחזיק שלוש צורות בבת אחת.</w:t>
       </w:r>
@@ -135,11 +136,11 @@
     <w:p>
       <w:pPr>
         <w:bidi/>
-        <w:spacing w:after="0"/>
+        <w:spacing w:after="120"/>
       </w:pPr>
       <w:r>
         <w:rPr>
-          <w:rFonts w:ascii="Arial" w:hAnsi="Arial" w:cs="Arial"/>
+          <w:rFonts w:ascii="David" w:hAnsi="David" w:cs="David"/>
           <w:b w:val="0"/>
           <w:i w:val="0"/>
           <w:color w:val="707070"/>
@@ -152,393 +153,13 @@
     </w:p>
     <w:p>
       <w:pPr>
-        <w:sectPr>
-          <w:headerReference w:type="default" r:id="rId9"/>
-          <w:pgSz w:w="11906" w:h="16838"/>
-          <w:pgMar w:top="680" w:right="680" w:bottom="680" w:left="680" w:header="0" w:footer="720" w:gutter="0"/>
-          <w:cols w:space="720"/>
-          <w:docGrid w:linePitch="360"/>
-        </w:sectPr>
-      </w:pPr>
-    </w:p>
-    <w:p>
-      <w:pPr>
         <w:bidi/>
-        <w:spacing w:after="0"/>
-      </w:pPr>
-      <w:r>
-        <w:rPr>
-          <w:rFonts w:ascii="Arial" w:hAnsi="Arial" w:cs="Arial"/>
-          <w:b w:val="0"/>
-          <w:i w:val="0"/>
-          <w:color w:val="111111"/>
-          <w:sz w:val="60"/>
-          <w:rtl/>
-          <w:szCs w:val="60"/>
-        </w:rPr>
-        <w:t>1</w:t>
-      </w:r>
-    </w:p>
-    <w:p>
-      <w:pPr>
-        <w:bidi/>
-        <w:spacing w:after="120"/>
-      </w:pPr>
-      <w:r>
-        <w:rPr>
-          <w:rFonts w:ascii="David" w:hAnsi="David" w:cs="David"/>
-          <w:b/>
-          <w:i w:val="0"/>
-          <w:color w:val="111111"/>
-          <w:sz w:val="32"/>
-          <w:rtl/>
-          <w:bCs/>
-          <w:szCs w:val="32"/>
-        </w:rPr>
-        <w:t>המשפט הישן</w:t>
-      </w:r>
-    </w:p>
-    <w:p>
-      <w:pPr>
-        <w:bidi/>
-        <w:spacing w:after="120"/>
-      </w:pPr>
-      <w:r>
-        <w:rPr>
-          <w:rFonts w:ascii="David" w:hAnsi="David" w:cs="David"/>
-          <w:b w:val="0"/>
-          <w:i w:val="0"/>
-          <w:color w:val="111111"/>
-          <w:sz w:val="21"/>
-          <w:rtl/>
-          <w:szCs w:val="21"/>
-        </w:rPr>
-        <w:t>בשיחה עם יוהאן פטר אקרמן במרץ 1829 קרא גתה לאדריכלות "מוזיקה שקפאה". רעיון דומה הופיע עוד קודם אצל הפילוסוף שלינג. מאז המשפט מצוטט בכל מקום, ותמיד באותו תפקיד: מחמאה לבניין, לא הוראת עבודה.</w:t>
-      </w:r>
-    </w:p>
-    <w:p>
-      <w:pPr>
-        <w:bidi/>
-        <w:spacing w:after="120"/>
-      </w:pPr>
-      <w:r>
-        <w:rPr>
-          <w:rFonts w:ascii="David" w:hAnsi="David" w:cs="David"/>
-          <w:b w:val="0"/>
-          <w:i w:val="0"/>
-          <w:color w:val="111111"/>
-          <w:sz w:val="21"/>
-          <w:rtl/>
-          <w:szCs w:val="21"/>
-        </w:rPr>
-        <w:t>הבעיה במטאפורה היא שאין לה כיוון חזור. אי אפשר להפשיר בניין ולשמוע אותו. אבל אם מתחילים צעד אחד קודם, במספרים שמהם נגזר המקום, אפשר. גובה קרקע, צפיפות, נפח תנועה: כל אלה הם סדרות, וסדרה יכולה להתנגן לפני שהיא נבנית.</w:t>
-      </w:r>
-    </w:p>
-    <w:p>
-      <w:pPr>
-        <w:bidi/>
-        <w:spacing w:after="280"/>
-      </w:pPr>
-      <w:r>
-        <w:rPr>
-          <w:rFonts w:ascii="David" w:hAnsi="David" w:cs="David"/>
-          <w:b/>
-          <w:i w:val="0"/>
-          <w:color w:val="111111"/>
-          <w:sz w:val="24"/>
-          <w:rtl/>
-          <w:bCs/>
-          <w:szCs w:val="24"/>
-        </w:rPr>
-        <w:t>מטאפורה הופכת לשיטה ברגע שאותו מספר מחויב לשתי הצורות.</w:t>
-      </w:r>
-    </w:p>
-    <w:p>
-      <w:pPr>
-        <w:bidi/>
-        <w:spacing w:after="0"/>
-      </w:pPr>
-      <w:r>
-        <w:rPr>
-          <w:rFonts w:ascii="Arial" w:hAnsi="Arial" w:cs="Arial"/>
-          <w:b w:val="0"/>
-          <w:i w:val="0"/>
-          <w:color w:val="111111"/>
-          <w:sz w:val="60"/>
-          <w:rtl/>
-          <w:szCs w:val="60"/>
-        </w:rPr>
-        <w:t>2</w:t>
-      </w:r>
-    </w:p>
-    <w:p>
-      <w:pPr>
-        <w:bidi/>
-        <w:spacing w:after="120"/>
-      </w:pPr>
-      <w:r>
-        <w:rPr>
-          <w:rFonts w:ascii="David" w:hAnsi="David" w:cs="David"/>
-          <w:b/>
-          <w:i w:val="0"/>
-          <w:color w:val="111111"/>
-          <w:sz w:val="32"/>
-          <w:rtl/>
-          <w:bCs/>
-          <w:szCs w:val="32"/>
-        </w:rPr>
-        <w:t>מקסנאקיס: כשהגליסנדו הפך לקליפה</w:t>
-      </w:r>
-    </w:p>
-    <w:p>
-      <w:pPr>
-        <w:bidi/>
-        <w:spacing w:after="120"/>
-      </w:pPr>
-      <w:r>
-        <w:rPr>
-          <w:rFonts w:ascii="David" w:hAnsi="David" w:cs="David"/>
-          <w:b w:val="0"/>
-          <w:i w:val="0"/>
-          <w:color w:val="111111"/>
-          <w:sz w:val="21"/>
-          <w:rtl/>
-          <w:szCs w:val="21"/>
-        </w:rPr>
-        <w:t>יאניס קסנאקיס עבד במשרד של לה קורבוזיה ובמקביל הלחין. ביצירה Metastaseis (1953–1954) הוא שרטט את הגליסנדי של כלי הקשת כקווים ישרים על נייר מילימטרי. הקווים יצרו יחד משטחים מעוקלים שנבנו כולם מישרים.</w:t>
-      </w:r>
-    </w:p>
-    <w:p>
-      <w:pPr>
-        <w:bidi/>
-        <w:spacing w:after="120"/>
-      </w:pPr>
-      <w:r>
-        <w:rPr>
-          <w:rFonts w:ascii="David" w:hAnsi="David" w:cs="David"/>
-          <w:b w:val="0"/>
-          <w:i w:val="0"/>
-          <w:color w:val="111111"/>
-          <w:sz w:val="21"/>
-          <w:rtl/>
-          <w:szCs w:val="21"/>
-        </w:rPr>
-        <w:t>כמה שנים אחר כך אותה גאומטריה הפכה לבניין: ביתן פיליפס בתערוכת אקספו 58 בבריסל, קליפות דקות של פרבולואידים היפרבוליים. הצליל והמבנה חלקו שרטוט אחד. זה בדיוק הגשר שהיצירות כאן הולכות עליו, רק שהשרטוט מגיע מנתונים עירוניים ולא מתווים.</w:t>
-      </w:r>
-    </w:p>
-    <w:p>
-      <w:pPr>
-        <w:bidi/>
-        <w:spacing w:after="280"/>
-      </w:pPr>
-      <w:r>
-        <w:rPr>
-          <w:rFonts w:ascii="David" w:hAnsi="David" w:cs="David"/>
-          <w:b/>
-          <w:i w:val="0"/>
-          <w:color w:val="111111"/>
-          <w:sz w:val="24"/>
-          <w:rtl/>
-          <w:bCs/>
-          <w:szCs w:val="24"/>
-        </w:rPr>
-        <w:t>הקו המשורטט הוא הגשר: מה שנמתח בזמן יכול להימתח במרחב.</w:t>
-      </w:r>
-    </w:p>
-    <w:p>
-      <w:pPr>
-        <w:bidi/>
-        <w:spacing w:after="40"/>
-      </w:pPr>
-      <w:r>
-        <w:rPr>
-          <w:rFonts w:ascii="Arial" w:hAnsi="Arial" w:cs="Arial"/>
-          <w:b w:val="0"/>
-          <w:i/>
-          <w:color w:val="707070"/>
-          <w:sz w:val="24"/>
-          <w:rtl/>
-          <w:szCs w:val="24"/>
-        </w:rPr>
-        <w:t>Ich nenne die Architektur eine erstarrte Musik.</w:t>
-      </w:r>
-    </w:p>
-    <w:p>
-      <w:pPr>
-        <w:bidi/>
-        <w:spacing w:after="40"/>
-      </w:pPr>
-      <w:r>
-        <w:rPr>
-          <w:rFonts w:ascii="David" w:hAnsi="David" w:cs="David"/>
-          <w:b w:val="0"/>
-          <w:i w:val="0"/>
-          <w:color w:val="111111"/>
-          <w:sz w:val="40"/>
-          <w:rtl/>
-          <w:szCs w:val="40"/>
-        </w:rPr>
-        <w:t>"אני קורא לאדריכלות מוזיקה שקפאה."</w:t>
-      </w:r>
-    </w:p>
-    <w:p>
-      <w:pPr>
-        <w:bidi/>
-        <w:spacing w:after="0"/>
-      </w:pPr>
-      <w:r>
-        <w:rPr>
-          <w:rFonts w:ascii="Arial" w:hAnsi="Arial" w:cs="Arial"/>
-          <w:b w:val="0"/>
-          <w:i w:val="0"/>
-          <w:color w:val="707070"/>
-          <w:sz w:val="16"/>
-          <w:rtl/>
-          <w:szCs w:val="16"/>
-        </w:rPr>
-        <w:t>גתה, בשיחה עם אקרמן, 1829</w:t>
-      </w:r>
-    </w:p>
-    <w:p>
-      <w:pPr>
-        <w:sectPr>
-          <w:headerReference w:type="default" r:id="rId11"/>
-          <w:pgSz w:w="11906" w:h="16838"/>
-          <w:pgMar w:top="680" w:right="680" w:bottom="680" w:left="680" w:header="0" w:footer="720" w:gutter="0"/>
-          <w:cols w:space="720"/>
-          <w:docGrid w:linePitch="360"/>
-        </w:sectPr>
-      </w:pPr>
-    </w:p>
-    <w:p>
-      <w:pPr>
-        <w:bidi/>
-        <w:spacing w:after="0"/>
-      </w:pPr>
-      <w:r>
-        <w:rPr>
-          <w:rFonts w:ascii="Arial" w:hAnsi="Arial" w:cs="Arial"/>
-          <w:b w:val="0"/>
-          <w:i w:val="0"/>
-          <w:color w:val="111111"/>
-          <w:sz w:val="60"/>
-          <w:rtl/>
-          <w:szCs w:val="60"/>
-        </w:rPr>
-        <w:t>3</w:t>
-      </w:r>
-    </w:p>
-    <w:p>
-      <w:pPr>
-        <w:bidi/>
-        <w:spacing w:after="120"/>
-      </w:pPr>
-      <w:r>
-        <w:rPr>
-          <w:rFonts w:ascii="David" w:hAnsi="David" w:cs="David"/>
-          <w:b/>
-          <w:i w:val="0"/>
-          <w:color w:val="111111"/>
-          <w:sz w:val="32"/>
-          <w:rtl/>
-          <w:bCs/>
-          <w:szCs w:val="32"/>
-        </w:rPr>
-        <w:t>שלוש קריאות של אותה סדרה</w:t>
-      </w:r>
-    </w:p>
-    <w:p>
-      <w:pPr>
-        <w:bidi/>
-        <w:spacing w:after="120"/>
-      </w:pPr>
-      <w:r>
-        <w:rPr>
-          <w:rFonts w:ascii="David" w:hAnsi="David" w:cs="David"/>
-          <w:b w:val="0"/>
-          <w:i w:val="0"/>
-          <w:color w:val="111111"/>
-          <w:sz w:val="21"/>
-          <w:rtl/>
-          <w:szCs w:val="21"/>
-        </w:rPr>
-        <w:t>הזמן. כל נקודה הופכת לצליל, והערך קובע את גובהו. מעל המנגינה נבנות הרמוניה שמתחלפת כשש־עשרה פעמים ביצירה, ביס שעוקב אחרי המגמה הרחבה, וקצב שמכה רק בנקודות מפנה. הכלל האחרון נבחן מול נתונים מלאכותיים: קו ישר לגמרי מקבל אפס חבטות, גל חלק כחמישה אחוזים, והילוך אקראי כשלושים ושישה. כך הקצב מודד חספוס ולא רעש.</w:t>
-      </w:r>
-    </w:p>
-    <w:p>
-      <w:pPr>
-        <w:bidi/>
-        <w:spacing w:after="120"/>
-      </w:pPr>
-      <w:r>
-        <w:rPr>
-          <w:rFonts w:ascii="David" w:hAnsi="David" w:cs="David"/>
-          <w:b w:val="0"/>
-          <w:i w:val="0"/>
-          <w:color w:val="111111"/>
-          <w:sz w:val="21"/>
-          <w:rtl/>
-          <w:szCs w:val="21"/>
-        </w:rPr>
-        <w:t>המקום. אותה סדרה נקראת כחזית שבה כל נקודה היא מבנה, כחתך שבו הנתונים הם הקרקע, כקולונדה שבה המקצב הופך לעמודים, או כמסה שבה הזמן עולה לגובה. הבחירה בטיפולוגיה היא שאלה שמפנים לנתונים: האם הם בניין או קרקע?</w:t>
-      </w:r>
-    </w:p>
-    <w:p>
-      <w:pPr>
-        <w:bidi/>
-        <w:spacing w:after="120"/>
-      </w:pPr>
-      <w:r>
-        <w:rPr>
-          <w:rFonts w:ascii="David" w:hAnsi="David" w:cs="David"/>
-          <w:b w:val="0"/>
-          <w:i w:val="0"/>
-          <w:color w:val="111111"/>
-          <w:sz w:val="21"/>
-          <w:rtl/>
-          <w:szCs w:val="21"/>
-        </w:rPr>
-        <w:t>הדימוי. לכל סדרה נכתב פרומפט שמחייב את הדימוי להחזיק את הצורה שלה: שתי קשתות לשני שיאי תנועה, חריץ צר לאפיק, ספירלה לגדילה שלא נעצרת. הדימוי הוא פרשנות, ולכן הוא מסומן תמיד כהדמיה.</w:t>
-      </w:r>
-    </w:p>
-    <w:p>
-      <w:pPr>
-        <w:bidi/>
-        <w:spacing w:after="280"/>
-      </w:pPr>
-      <w:r>
-        <w:rPr>
-          <w:rFonts w:ascii="David" w:hAnsi="David" w:cs="David"/>
-          <w:b/>
-          <w:i w:val="0"/>
-          <w:color w:val="111111"/>
-          <w:sz w:val="24"/>
-          <w:rtl/>
-          <w:bCs/>
-          <w:szCs w:val="24"/>
-        </w:rPr>
-        <w:t>הטיפולוגיה היא שאלה שמפנים לנתונים, לא קישוט שמלבישים עליהם.</w:t>
-      </w:r>
-    </w:p>
-    <w:p>
-      <w:pPr>
-        <w:sectPr>
-          <w:headerReference w:type="default" r:id="rId12"/>
-          <w:pgSz w:w="11906" w:h="16838"/>
-          <w:pgMar w:top="680" w:right="680" w:bottom="680" w:left="680" w:header="0" w:footer="720" w:gutter="0"/>
-          <w:cols w:space="720"/>
-          <w:docGrid w:linePitch="360"/>
-        </w:sectPr>
-      </w:pPr>
-    </w:p>
-    <w:p>
-      <w:pPr>
-        <w:bidi/>
+        <w:spacing w:after="80"/>
       </w:pPr>
       <w:r>
         <w:drawing>
           <wp:inline xmlns:a="http://schemas.openxmlformats.org/drawingml/2006/main" xmlns:pic="http://schemas.openxmlformats.org/drawingml/2006/picture">
-            <wp:extent cx="2808000" cy="2808000"/>
+            <wp:extent cx="6696000" cy="1664489"/>
             <wp:docPr id="2" name="Picture 2"/>
             <wp:cNvGraphicFramePr>
               <a:graphicFrameLocks noChangeAspect="1"/>
@@ -547,11 +168,11 @@
               <a:graphicData uri="http://schemas.openxmlformats.org/drawingml/2006/picture">
                 <pic:pic>
                   <pic:nvPicPr>
-                    <pic:cNvPr id="0" name="01_ashdod_elevation.jpg"/>
+                    <pic:cNvPr id="0" name="band-01.png"/>
                     <pic:cNvPicPr/>
                   </pic:nvPicPr>
                   <pic:blipFill>
-                    <a:blip r:embed="rId14"/>
+                    <a:blip r:embed="rId11"/>
                     <a:stretch>
                       <a:fillRect/>
                     </a:stretch>
@@ -559,7 +180,7 @@
                   <pic:spPr>
                     <a:xfrm>
                       <a:off x="0" y="0"/>
-                      <a:ext cx="2808000" cy="2808000"/>
+                      <a:ext cx="6696000" cy="1664489"/>
                     </a:xfrm>
                     <a:prstGeom prst="rect"/>
                   </pic:spPr>
@@ -572,8 +193,59 @@
     </w:p>
     <w:p>
       <w:pPr>
+        <w:sectPr>
+          <w:headerReference w:type="default" r:id="rId9"/>
+          <w:pgSz w:w="11906" w:h="16838"/>
+          <w:pgMar w:top="680" w:right="680" w:bottom="680" w:left="680" w:header="0" w:footer="720" w:gutter="0"/>
+          <w:cols w:space="720"/>
+          <w:docGrid w:linePitch="360"/>
+        </w:sectPr>
+      </w:pPr>
+    </w:p>
+    <w:p>
+      <w:pPr>
         <w:bidi/>
         <w:spacing w:after="80"/>
+      </w:pPr>
+      <w:r>
+        <w:drawing>
+          <wp:inline xmlns:a="http://schemas.openxmlformats.org/drawingml/2006/main" xmlns:pic="http://schemas.openxmlformats.org/drawingml/2006/picture">
+            <wp:extent cx="4032000" cy="4032000"/>
+            <wp:docPr id="3" name="Picture 3"/>
+            <wp:cNvGraphicFramePr>
+              <a:graphicFrameLocks noChangeAspect="1"/>
+            </wp:cNvGraphicFramePr>
+            <a:graphic>
+              <a:graphicData uri="http://schemas.openxmlformats.org/drawingml/2006/picture">
+                <pic:pic>
+                  <pic:nvPicPr>
+                    <pic:cNvPr id="0" name="ch1_frozen_music.jpg"/>
+                    <pic:cNvPicPr/>
+                  </pic:nvPicPr>
+                  <pic:blipFill>
+                    <a:blip r:embed="rId13"/>
+                    <a:stretch>
+                      <a:fillRect/>
+                    </a:stretch>
+                  </pic:blipFill>
+                  <pic:spPr>
+                    <a:xfrm>
+                      <a:off x="0" y="0"/>
+                      <a:ext cx="4032000" cy="4032000"/>
+                    </a:xfrm>
+                    <a:prstGeom prst="rect"/>
+                  </pic:spPr>
+                </pic:pic>
+              </a:graphicData>
+            </a:graphic>
+          </wp:inline>
+        </w:drawing>
+      </w:r>
+    </w:p>
+    <w:p>
+      <w:pPr>
+        <w:bidi/>
+        <w:spacing w:after="120"/>
       </w:pPr>
       <w:r>
         <w:rPr>
@@ -595,6 +267,24 @@
       </w:pPr>
       <w:r>
         <w:rPr>
+          <w:rFonts w:ascii="Arial" w:hAnsi="Arial" w:cs="Arial"/>
+          <w:b w:val="0"/>
+          <w:i w:val="0"/>
+          <w:color w:val="111111"/>
+          <w:sz w:val="52"/>
+          <w:rtl/>
+          <w:szCs w:val="52"/>
+        </w:rPr>
+        <w:t>1</w:t>
+      </w:r>
+    </w:p>
+    <w:p>
+      <w:pPr>
+        <w:bidi/>
+        <w:spacing w:after="0"/>
+      </w:pPr>
+      <w:r>
+        <w:rPr>
           <w:rFonts w:ascii="David" w:hAnsi="David" w:cs="David"/>
           <w:b/>
           <w:i w:val="0"/>
@@ -604,13 +294,688 @@
           <w:bCs/>
           <w:szCs w:val="30"/>
         </w:rPr>
-        <w:t>01  סרט החוף</w:t>
+        <w:t>המשפט הישן</w:t>
       </w:r>
     </w:p>
     <w:p>
       <w:pPr>
         <w:bidi/>
+        <w:spacing w:after="120"/>
+      </w:pPr>
+      <w:r>
+        <w:rPr>
+          <w:rFonts w:ascii="Arial" w:hAnsi="Arial" w:cs="Arial"/>
+          <w:b w:val="0"/>
+          <w:i w:val="0"/>
+          <w:color w:val="707070"/>
+          <w:sz w:val="14"/>
+          <w:rtl/>
+          <w:szCs w:val="14"/>
+        </w:rPr>
+        <w:t>GOETHE, 1829</w:t>
+      </w:r>
+    </w:p>
+    <w:p>
+      <w:pPr>
+        <w:bidi/>
         <w:spacing w:after="80"/>
+      </w:pPr>
+      <w:r>
+        <w:rPr>
+          <w:rFonts w:ascii="David" w:hAnsi="David" w:cs="David"/>
+          <w:b w:val="0"/>
+          <w:i w:val="0"/>
+          <w:color w:val="111111"/>
+          <w:sz w:val="20"/>
+          <w:rtl/>
+          <w:szCs w:val="20"/>
+        </w:rPr>
+        <w:t>בשיחה עם יוהאן פטר אקרמן במרץ 1829 קרא גתה לאדריכלות "מוזיקה שקפאה". רעיון דומה הופיע עוד קודם אצל הפילוסוף שלינג. מאז המשפט מצוטט בכל מקום, ותמיד באותו תפקיד: מחמאה לבניין, לא הוראת עבודה.</w:t>
+      </w:r>
+    </w:p>
+    <w:p>
+      <w:pPr>
+        <w:bidi/>
+        <w:spacing w:after="80"/>
+      </w:pPr>
+      <w:r>
+        <w:rPr>
+          <w:rFonts w:ascii="David" w:hAnsi="David" w:cs="David"/>
+          <w:b w:val="0"/>
+          <w:i w:val="0"/>
+          <w:color w:val="111111"/>
+          <w:sz w:val="20"/>
+          <w:rtl/>
+          <w:szCs w:val="20"/>
+        </w:rPr>
+        <w:t>הבעיה במטאפורה היא שאין לה כיוון חזור. אי אפשר להפשיר בניין ולשמוע אותו. אבל אם מתחילים צעד אחד קודם, במספרים שמהם נגזר המקום, אפשר. גובה קרקע, צפיפות, נפח תנועה: כל אלה הם סדרות, וסדרה יכולה להתנגן לפני שהיא נבנית.</w:t>
+      </w:r>
+    </w:p>
+    <w:p>
+      <w:pPr>
+        <w:bidi/>
+        <w:spacing w:after="120"/>
+      </w:pPr>
+      <w:r>
+        <w:rPr>
+          <w:rFonts w:ascii="David" w:hAnsi="David" w:cs="David"/>
+          <w:b/>
+          <w:i w:val="0"/>
+          <w:color w:val="111111"/>
+          <w:sz w:val="23"/>
+          <w:rtl/>
+          <w:bCs/>
+          <w:szCs w:val="23"/>
+        </w:rPr>
+        <w:t>מטאפורה הופכת לשיטה ברגע שאותו מספר מחויב לשתי הצורות.</w:t>
+      </w:r>
+    </w:p>
+    <w:p>
+      <w:pPr>
+        <w:bidi/>
+        <w:spacing w:after="80"/>
+      </w:pPr>
+      <w:r>
+        <w:drawing>
+          <wp:inline xmlns:a="http://schemas.openxmlformats.org/drawingml/2006/main" xmlns:pic="http://schemas.openxmlformats.org/drawingml/2006/picture">
+            <wp:extent cx="6696000" cy="1654977"/>
+            <wp:docPr id="4" name="Picture 4"/>
+            <wp:cNvGraphicFramePr>
+              <a:graphicFrameLocks noChangeAspect="1"/>
+            </wp:cNvGraphicFramePr>
+            <a:graphic>
+              <a:graphicData uri="http://schemas.openxmlformats.org/drawingml/2006/picture">
+                <pic:pic>
+                  <pic:nvPicPr>
+                    <pic:cNvPr id="0" name="band-02.png"/>
+                    <pic:cNvPicPr/>
+                  </pic:nvPicPr>
+                  <pic:blipFill>
+                    <a:blip r:embed="rId14"/>
+                    <a:stretch>
+                      <a:fillRect/>
+                    </a:stretch>
+                  </pic:blipFill>
+                  <pic:spPr>
+                    <a:xfrm>
+                      <a:off x="0" y="0"/>
+                      <a:ext cx="6696000" cy="1654977"/>
+                    </a:xfrm>
+                    <a:prstGeom prst="rect"/>
+                  </pic:spPr>
+                </pic:pic>
+              </a:graphicData>
+            </a:graphic>
+          </wp:inline>
+        </w:drawing>
+      </w:r>
+    </w:p>
+    <w:p>
+      <w:pPr>
+        <w:sectPr>
+          <w:headerReference w:type="default" r:id="rId12"/>
+          <w:pgSz w:w="11906" w:h="16838"/>
+          <w:pgMar w:top="680" w:right="680" w:bottom="680" w:left="680" w:header="0" w:footer="720" w:gutter="0"/>
+          <w:cols w:space="720"/>
+          <w:docGrid w:linePitch="360"/>
+        </w:sectPr>
+      </w:pPr>
+    </w:p>
+    <w:p>
+      <w:pPr>
+        <w:bidi/>
+        <w:spacing w:after="80"/>
+      </w:pPr>
+      <w:r>
+        <w:drawing>
+          <wp:inline xmlns:a="http://schemas.openxmlformats.org/drawingml/2006/main" xmlns:pic="http://schemas.openxmlformats.org/drawingml/2006/picture">
+            <wp:extent cx="4032000" cy="4032000"/>
+            <wp:docPr id="5" name="Picture 5"/>
+            <wp:cNvGraphicFramePr>
+              <a:graphicFrameLocks noChangeAspect="1"/>
+            </wp:cNvGraphicFramePr>
+            <a:graphic>
+              <a:graphicData uri="http://schemas.openxmlformats.org/drawingml/2006/picture">
+                <pic:pic>
+                  <pic:nvPicPr>
+                    <pic:cNvPr id="0" name="ch2_ruled_shell.jpg"/>
+                    <pic:cNvPicPr/>
+                  </pic:nvPicPr>
+                  <pic:blipFill>
+                    <a:blip r:embed="rId16"/>
+                    <a:stretch>
+                      <a:fillRect/>
+                    </a:stretch>
+                  </pic:blipFill>
+                  <pic:spPr>
+                    <a:xfrm>
+                      <a:off x="0" y="0"/>
+                      <a:ext cx="4032000" cy="4032000"/>
+                    </a:xfrm>
+                    <a:prstGeom prst="rect"/>
+                  </pic:spPr>
+                </pic:pic>
+              </a:graphicData>
+            </a:graphic>
+          </wp:inline>
+        </w:drawing>
+      </w:r>
+    </w:p>
+    <w:p>
+      <w:pPr>
+        <w:bidi/>
+        <w:spacing w:after="120"/>
+      </w:pPr>
+      <w:r>
+        <w:rPr>
+          <w:rFonts w:ascii="Arial" w:hAnsi="Arial" w:cs="Arial"/>
+          <w:b w:val="0"/>
+          <w:i w:val="0"/>
+          <w:color w:val="707070"/>
+          <w:sz w:val="14"/>
+          <w:rtl/>
+          <w:szCs w:val="14"/>
+        </w:rPr>
+        <w:t>הדמיה</w:t>
+      </w:r>
+    </w:p>
+    <w:p>
+      <w:pPr>
+        <w:bidi/>
+        <w:spacing w:after="0"/>
+      </w:pPr>
+      <w:r>
+        <w:rPr>
+          <w:rFonts w:ascii="Arial" w:hAnsi="Arial" w:cs="Arial"/>
+          <w:b w:val="0"/>
+          <w:i w:val="0"/>
+          <w:color w:val="111111"/>
+          <w:sz w:val="52"/>
+          <w:rtl/>
+          <w:szCs w:val="52"/>
+        </w:rPr>
+        <w:t>2</w:t>
+      </w:r>
+    </w:p>
+    <w:p>
+      <w:pPr>
+        <w:bidi/>
+        <w:spacing w:after="0"/>
+      </w:pPr>
+      <w:r>
+        <w:rPr>
+          <w:rFonts w:ascii="David" w:hAnsi="David" w:cs="David"/>
+          <w:b/>
+          <w:i w:val="0"/>
+          <w:color w:val="111111"/>
+          <w:sz w:val="30"/>
+          <w:rtl/>
+          <w:bCs/>
+          <w:szCs w:val="30"/>
+        </w:rPr>
+        <w:t>מקסנאקיס: כשהגליסנדו הפך לקליפה</w:t>
+      </w:r>
+    </w:p>
+    <w:p>
+      <w:pPr>
+        <w:bidi/>
+        <w:spacing w:after="120"/>
+      </w:pPr>
+      <w:r>
+        <w:rPr>
+          <w:rFonts w:ascii="Arial" w:hAnsi="Arial" w:cs="Arial"/>
+          <w:b w:val="0"/>
+          <w:i w:val="0"/>
+          <w:color w:val="707070"/>
+          <w:sz w:val="14"/>
+          <w:rtl/>
+          <w:szCs w:val="14"/>
+        </w:rPr>
+        <w:t>IANNIS XENAKIS, EXPO 58</w:t>
+      </w:r>
+    </w:p>
+    <w:p>
+      <w:pPr>
+        <w:bidi/>
+        <w:spacing w:after="80"/>
+      </w:pPr>
+      <w:r>
+        <w:rPr>
+          <w:rFonts w:ascii="David" w:hAnsi="David" w:cs="David"/>
+          <w:b w:val="0"/>
+          <w:i w:val="0"/>
+          <w:color w:val="111111"/>
+          <w:sz w:val="20"/>
+          <w:rtl/>
+          <w:szCs w:val="20"/>
+        </w:rPr>
+        <w:t>יאניס קסנאקיס עבד במשרד של לה קורבוזיה ובמקביל הלחין. ביצירה Metastaseis (1953–1954) הוא שרטט את הגליסנדי של כלי הקשת כקווים ישרים על נייר מילימטרי. הקווים יצרו יחד משטחים מעוקלים שנבנו כולם מישרים.</w:t>
+      </w:r>
+    </w:p>
+    <w:p>
+      <w:pPr>
+        <w:bidi/>
+        <w:spacing w:after="80"/>
+      </w:pPr>
+      <w:r>
+        <w:rPr>
+          <w:rFonts w:ascii="David" w:hAnsi="David" w:cs="David"/>
+          <w:b w:val="0"/>
+          <w:i w:val="0"/>
+          <w:color w:val="111111"/>
+          <w:sz w:val="20"/>
+          <w:rtl/>
+          <w:szCs w:val="20"/>
+        </w:rPr>
+        <w:t>כמה שנים אחר כך אותה גאומטריה הפכה לבניין: ביתן פיליפס בתערוכת אקספו 58 בבריסל, קליפות דקות של פרבולואידים היפרבוליים. הצליל והמבנה חלקו שרטוט אחד. זה בדיוק הגשר שהיצירות כאן הולכות עליו, רק שהשרטוט מגיע מנתונים עירוניים ולא מתווים.</w:t>
+      </w:r>
+    </w:p>
+    <w:p>
+      <w:pPr>
+        <w:bidi/>
+        <w:spacing w:after="120"/>
+      </w:pPr>
+      <w:r>
+        <w:rPr>
+          <w:rFonts w:ascii="David" w:hAnsi="David" w:cs="David"/>
+          <w:b/>
+          <w:i w:val="0"/>
+          <w:color w:val="111111"/>
+          <w:sz w:val="23"/>
+          <w:rtl/>
+          <w:bCs/>
+          <w:szCs w:val="23"/>
+        </w:rPr>
+        <w:t>הקו המשורטט הוא הגשר: מה שנמתח בזמן יכול להימתח במרחב.</w:t>
+      </w:r>
+    </w:p>
+    <w:p>
+      <w:pPr>
+        <w:bidi/>
+        <w:spacing w:after="80"/>
+      </w:pPr>
+      <w:r>
+        <w:drawing>
+          <wp:inline xmlns:a="http://schemas.openxmlformats.org/drawingml/2006/main" xmlns:pic="http://schemas.openxmlformats.org/drawingml/2006/picture">
+            <wp:extent cx="6696000" cy="1664489"/>
+            <wp:docPr id="6" name="Picture 6"/>
+            <wp:cNvGraphicFramePr>
+              <a:graphicFrameLocks noChangeAspect="1"/>
+            </wp:cNvGraphicFramePr>
+            <a:graphic>
+              <a:graphicData uri="http://schemas.openxmlformats.org/drawingml/2006/picture">
+                <pic:pic>
+                  <pic:nvPicPr>
+                    <pic:cNvPr id="0" name="band-03.png"/>
+                    <pic:cNvPicPr/>
+                  </pic:nvPicPr>
+                  <pic:blipFill>
+                    <a:blip r:embed="rId17"/>
+                    <a:stretch>
+                      <a:fillRect/>
+                    </a:stretch>
+                  </pic:blipFill>
+                  <pic:spPr>
+                    <a:xfrm>
+                      <a:off x="0" y="0"/>
+                      <a:ext cx="6696000" cy="1664489"/>
+                    </a:xfrm>
+                    <a:prstGeom prst="rect"/>
+                  </pic:spPr>
+                </pic:pic>
+              </a:graphicData>
+            </a:graphic>
+          </wp:inline>
+        </w:drawing>
+      </w:r>
+    </w:p>
+    <w:p>
+      <w:pPr>
+        <w:sectPr>
+          <w:headerReference w:type="default" r:id="rId15"/>
+          <w:pgSz w:w="11906" w:h="16838"/>
+          <w:pgMar w:top="680" w:right="680" w:bottom="680" w:left="680" w:header="0" w:footer="720" w:gutter="0"/>
+          <w:cols w:space="720"/>
+          <w:docGrid w:linePitch="360"/>
+        </w:sectPr>
+      </w:pPr>
+    </w:p>
+    <w:p>
+      <w:pPr>
+        <w:bidi/>
+        <w:spacing w:after="80"/>
+      </w:pPr>
+      <w:r>
+        <w:drawing>
+          <wp:inline xmlns:a="http://schemas.openxmlformats.org/drawingml/2006/main" xmlns:pic="http://schemas.openxmlformats.org/drawingml/2006/picture">
+            <wp:extent cx="4032000" cy="4032000"/>
+            <wp:docPr id="7" name="Picture 7"/>
+            <wp:cNvGraphicFramePr>
+              <a:graphicFrameLocks noChangeAspect="1"/>
+            </wp:cNvGraphicFramePr>
+            <a:graphic>
+              <a:graphicData uri="http://schemas.openxmlformats.org/drawingml/2006/picture">
+                <pic:pic>
+                  <pic:nvPicPr>
+                    <pic:cNvPr id="0" name="ch3_three_readings.jpg"/>
+                    <pic:cNvPicPr/>
+                  </pic:nvPicPr>
+                  <pic:blipFill>
+                    <a:blip r:embed="rId19"/>
+                    <a:stretch>
+                      <a:fillRect/>
+                    </a:stretch>
+                  </pic:blipFill>
+                  <pic:spPr>
+                    <a:xfrm>
+                      <a:off x="0" y="0"/>
+                      <a:ext cx="4032000" cy="4032000"/>
+                    </a:xfrm>
+                    <a:prstGeom prst="rect"/>
+                  </pic:spPr>
+                </pic:pic>
+              </a:graphicData>
+            </a:graphic>
+          </wp:inline>
+        </w:drawing>
+      </w:r>
+    </w:p>
+    <w:p>
+      <w:pPr>
+        <w:bidi/>
+        <w:spacing w:after="120"/>
+      </w:pPr>
+      <w:r>
+        <w:rPr>
+          <w:rFonts w:ascii="Arial" w:hAnsi="Arial" w:cs="Arial"/>
+          <w:b w:val="0"/>
+          <w:i w:val="0"/>
+          <w:color w:val="707070"/>
+          <w:sz w:val="14"/>
+          <w:rtl/>
+          <w:szCs w:val="14"/>
+        </w:rPr>
+        <w:t>הדמיה</w:t>
+      </w:r>
+    </w:p>
+    <w:p>
+      <w:pPr>
+        <w:bidi/>
+        <w:spacing w:after="0"/>
+      </w:pPr>
+      <w:r>
+        <w:rPr>
+          <w:rFonts w:ascii="Arial" w:hAnsi="Arial" w:cs="Arial"/>
+          <w:b w:val="0"/>
+          <w:i w:val="0"/>
+          <w:color w:val="111111"/>
+          <w:sz w:val="52"/>
+          <w:rtl/>
+          <w:szCs w:val="52"/>
+        </w:rPr>
+        <w:t>3</w:t>
+      </w:r>
+    </w:p>
+    <w:p>
+      <w:pPr>
+        <w:bidi/>
+        <w:spacing w:after="0"/>
+      </w:pPr>
+      <w:r>
+        <w:rPr>
+          <w:rFonts w:ascii="David" w:hAnsi="David" w:cs="David"/>
+          <w:b/>
+          <w:i w:val="0"/>
+          <w:color w:val="111111"/>
+          <w:sz w:val="30"/>
+          <w:rtl/>
+          <w:bCs/>
+          <w:szCs w:val="30"/>
+        </w:rPr>
+        <w:t>שלוש קריאות של אותה סדרה</w:t>
+      </w:r>
+    </w:p>
+    <w:p>
+      <w:pPr>
+        <w:bidi/>
+        <w:spacing w:after="120"/>
+      </w:pPr>
+      <w:r>
+        <w:rPr>
+          <w:rFonts w:ascii="Arial" w:hAnsi="Arial" w:cs="Arial"/>
+          <w:b w:val="0"/>
+          <w:i w:val="0"/>
+          <w:color w:val="707070"/>
+          <w:sz w:val="14"/>
+          <w:rtl/>
+          <w:szCs w:val="14"/>
+        </w:rPr>
+        <w:t>TIME, SPACE, IMAGE</w:t>
+      </w:r>
+    </w:p>
+    <w:p>
+      <w:pPr>
+        <w:bidi/>
+        <w:spacing w:after="80"/>
+      </w:pPr>
+      <w:r>
+        <w:rPr>
+          <w:rFonts w:ascii="David" w:hAnsi="David" w:cs="David"/>
+          <w:b w:val="0"/>
+          <w:i w:val="0"/>
+          <w:color w:val="111111"/>
+          <w:sz w:val="20"/>
+          <w:rtl/>
+          <w:szCs w:val="20"/>
+        </w:rPr>
+        <w:t>הזמן. כל נקודה הופכת לצליל, והערך קובע את גובהו. מעל המנגינה נבנות הרמוניה שמתחלפת כשש־עשרה פעמים ביצירה, ביס שעוקב אחרי המגמה הרחבה, וקצב שמכה רק בנקודות מפנה. הכלל האחרון נבחן מול נתונים מלאכותיים: קו ישר לגמרי מקבל אפס חבטות, גל חלק כחמישה אחוזים, והילוך אקראי כשלושים ושישה. כך הקצב מודד חספוס ולא רעש.</w:t>
+      </w:r>
+    </w:p>
+    <w:p>
+      <w:pPr>
+        <w:bidi/>
+        <w:spacing w:after="80"/>
+      </w:pPr>
+      <w:r>
+        <w:rPr>
+          <w:rFonts w:ascii="David" w:hAnsi="David" w:cs="David"/>
+          <w:b w:val="0"/>
+          <w:i w:val="0"/>
+          <w:color w:val="111111"/>
+          <w:sz w:val="20"/>
+          <w:rtl/>
+          <w:szCs w:val="20"/>
+        </w:rPr>
+        <w:t>המקום. אותה סדרה נקראת כחזית שבה כל נקודה היא מבנה, כחתך שבו הנתונים הם הקרקע, כקולונדה שבה המקצב הופך לעמודים, או כמסה שבה הזמן עולה לגובה. הבחירה בטיפולוגיה היא שאלה שמפנים לנתונים: האם הם בניין או קרקע?</w:t>
+      </w:r>
+    </w:p>
+    <w:p>
+      <w:pPr>
+        <w:bidi/>
+        <w:spacing w:after="80"/>
+      </w:pPr>
+      <w:r>
+        <w:rPr>
+          <w:rFonts w:ascii="David" w:hAnsi="David" w:cs="David"/>
+          <w:b w:val="0"/>
+          <w:i w:val="0"/>
+          <w:color w:val="111111"/>
+          <w:sz w:val="20"/>
+          <w:rtl/>
+          <w:szCs w:val="20"/>
+        </w:rPr>
+        <w:t>הדימוי. לכל סדרה נכתב פרומפט שמחייב את הדימוי להחזיק את הצורה שלה: שתי קשתות לשני שיאי תנועה, חריץ צר לאפיק, ספירלה לגדילה שלא נעצרת. הדימוי הוא פרשנות, ולכן הוא מסומן תמיד כהדמיה.</w:t>
+      </w:r>
+    </w:p>
+    <w:p>
+      <w:pPr>
+        <w:bidi/>
+        <w:spacing w:after="120"/>
+      </w:pPr>
+      <w:r>
+        <w:rPr>
+          <w:rFonts w:ascii="David" w:hAnsi="David" w:cs="David"/>
+          <w:b/>
+          <w:i w:val="0"/>
+          <w:color w:val="111111"/>
+          <w:sz w:val="23"/>
+          <w:rtl/>
+          <w:bCs/>
+          <w:szCs w:val="23"/>
+        </w:rPr>
+        <w:t>הטיפולוגיה היא שאלה שמפנים לנתונים, לא קישוט שמלבישים עליהם.</w:t>
+      </w:r>
+    </w:p>
+    <w:p>
+      <w:pPr>
+        <w:bidi/>
+        <w:spacing w:after="80"/>
+      </w:pPr>
+      <w:r>
+        <w:drawing>
+          <wp:inline xmlns:a="http://schemas.openxmlformats.org/drawingml/2006/main" xmlns:pic="http://schemas.openxmlformats.org/drawingml/2006/picture">
+            <wp:extent cx="6696000" cy="1664489"/>
+            <wp:docPr id="8" name="Picture 8"/>
+            <wp:cNvGraphicFramePr>
+              <a:graphicFrameLocks noChangeAspect="1"/>
+            </wp:cNvGraphicFramePr>
+            <a:graphic>
+              <a:graphicData uri="http://schemas.openxmlformats.org/drawingml/2006/picture">
+                <pic:pic>
+                  <pic:nvPicPr>
+                    <pic:cNvPr id="0" name="band-04.png"/>
+                    <pic:cNvPicPr/>
+                  </pic:nvPicPr>
+                  <pic:blipFill>
+                    <a:blip r:embed="rId20"/>
+                    <a:stretch>
+                      <a:fillRect/>
+                    </a:stretch>
+                  </pic:blipFill>
+                  <pic:spPr>
+                    <a:xfrm>
+                      <a:off x="0" y="0"/>
+                      <a:ext cx="6696000" cy="1664489"/>
+                    </a:xfrm>
+                    <a:prstGeom prst="rect"/>
+                  </pic:spPr>
+                </pic:pic>
+              </a:graphicData>
+            </a:graphic>
+          </wp:inline>
+        </w:drawing>
+      </w:r>
+    </w:p>
+    <w:p>
+      <w:pPr>
+        <w:sectPr>
+          <w:headerReference w:type="default" r:id="rId18"/>
+          <w:pgSz w:w="11906" w:h="16838"/>
+          <w:pgMar w:top="680" w:right="680" w:bottom="680" w:left="680" w:header="0" w:footer="720" w:gutter="0"/>
+          <w:cols w:space="720"/>
+          <w:docGrid w:linePitch="360"/>
+        </w:sectPr>
+      </w:pPr>
+    </w:p>
+    <w:p>
+      <w:pPr>
+        <w:bidi/>
+        <w:spacing w:after="80"/>
+      </w:pPr>
+      <w:r>
+        <w:drawing>
+          <wp:inline xmlns:a="http://schemas.openxmlformats.org/drawingml/2006/main" xmlns:pic="http://schemas.openxmlformats.org/drawingml/2006/picture">
+            <wp:extent cx="4032000" cy="4032000"/>
+            <wp:docPr id="9" name="Picture 9"/>
+            <wp:cNvGraphicFramePr>
+              <a:graphicFrameLocks noChangeAspect="1"/>
+            </wp:cNvGraphicFramePr>
+            <a:graphic>
+              <a:graphicData uri="http://schemas.openxmlformats.org/drawingml/2006/picture">
+                <pic:pic>
+                  <pic:nvPicPr>
+                    <pic:cNvPr id="0" name="01_ashdod_elevation.jpg"/>
+                    <pic:cNvPicPr/>
+                  </pic:nvPicPr>
+                  <pic:blipFill>
+                    <a:blip r:embed="rId22"/>
+                    <a:stretch>
+                      <a:fillRect/>
+                    </a:stretch>
+                  </pic:blipFill>
+                  <pic:spPr>
+                    <a:xfrm>
+                      <a:off x="0" y="0"/>
+                      <a:ext cx="4032000" cy="4032000"/>
+                    </a:xfrm>
+                    <a:prstGeom prst="rect"/>
+                  </pic:spPr>
+                </pic:pic>
+              </a:graphicData>
+            </a:graphic>
+          </wp:inline>
+        </w:drawing>
+      </w:r>
+    </w:p>
+    <w:p>
+      <w:pPr>
+        <w:bidi/>
+        <w:spacing w:after="120"/>
+      </w:pPr>
+      <w:r>
+        <w:rPr>
+          <w:rFonts w:ascii="Arial" w:hAnsi="Arial" w:cs="Arial"/>
+          <w:b w:val="0"/>
+          <w:i w:val="0"/>
+          <w:color w:val="707070"/>
+          <w:sz w:val="14"/>
+          <w:rtl/>
+          <w:szCs w:val="14"/>
+        </w:rPr>
+        <w:t>הדמיה</w:t>
+      </w:r>
+    </w:p>
+    <w:p>
+      <w:pPr>
+        <w:bidi/>
+        <w:spacing w:after="0"/>
+      </w:pPr>
+      <w:r>
+        <w:rPr>
+          <w:rFonts w:ascii="Arial" w:hAnsi="Arial" w:cs="Arial"/>
+          <w:b w:val="0"/>
+          <w:i w:val="0"/>
+          <w:color w:val="111111"/>
+          <w:sz w:val="52"/>
+          <w:rtl/>
+          <w:szCs w:val="52"/>
+        </w:rPr>
+        <w:t>01</w:t>
+      </w:r>
+    </w:p>
+    <w:p>
+      <w:pPr>
+        <w:bidi/>
+        <w:spacing w:after="0"/>
+      </w:pPr>
+      <w:r>
+        <w:rPr>
+          <w:rFonts w:ascii="David" w:hAnsi="David" w:cs="David"/>
+          <w:b/>
+          <w:i w:val="0"/>
+          <w:color w:val="111111"/>
+          <w:sz w:val="30"/>
+          <w:rtl/>
+          <w:bCs/>
+          <w:szCs w:val="30"/>
+        </w:rPr>
+        <w:t>סרט החוף</w:t>
+      </w:r>
+    </w:p>
+    <w:p>
+      <w:pPr>
+        <w:bidi/>
+        <w:spacing w:after="120"/>
       </w:pPr>
       <w:r>
         <w:rPr>
@@ -628,7 +993,7 @@
     <w:p>
       <w:pPr>
         <w:bidi/>
-        <w:spacing w:after="60"/>
+        <w:spacing w:after="80"/>
       </w:pPr>
       <w:r>
         <w:rPr>
@@ -636,10 +1001,10 @@
           <w:b/>
           <w:i w:val="0"/>
           <w:color w:val="111111"/>
-          <w:sz w:val="19"/>
+          <w:sz w:val="20"/>
           <w:rtl/>
           <w:bCs/>
-          <w:szCs w:val="19"/>
+          <w:szCs w:val="20"/>
         </w:rPr>
         <w:t xml:space="preserve">הנתונים. </w:t>
       </w:r>
@@ -649,9 +1014,9 @@
           <w:b w:val="0"/>
           <w:i w:val="0"/>
           <w:color w:val="111111"/>
-          <w:sz w:val="19"/>
+          <w:sz w:val="20"/>
           <w:rtl/>
-          <w:szCs w:val="19"/>
+          <w:szCs w:val="20"/>
         </w:rPr>
         <w:t>חתך גובה ממערב למזרח באשדוד: קו המים, רכס הכורכר, השקע שמאחוריו, ועלייה ארוכה אל השפלה.</w:t>
       </w:r>
@@ -659,7 +1024,7 @@
     <w:p>
       <w:pPr>
         <w:bidi/>
-        <w:spacing w:after="60"/>
+        <w:spacing w:after="80"/>
       </w:pPr>
       <w:r>
         <w:rPr>
@@ -667,10 +1032,10 @@
           <w:b/>
           <w:i w:val="0"/>
           <w:color w:val="111111"/>
-          <w:sz w:val="19"/>
+          <w:sz w:val="20"/>
           <w:rtl/>
           <w:bCs/>
-          <w:szCs w:val="19"/>
+          <w:szCs w:val="20"/>
         </w:rPr>
         <w:t xml:space="preserve">הצליל. </w:t>
       </w:r>
@@ -680,9 +1045,9 @@
           <w:b w:val="0"/>
           <w:i w:val="0"/>
           <w:color w:val="111111"/>
-          <w:sz w:val="19"/>
+          <w:sz w:val="20"/>
           <w:rtl/>
-          <w:szCs w:val="19"/>
+          <w:szCs w:val="20"/>
         </w:rPr>
         <w:t>שלוש תנועות. הצליל הגבוה ביותר הוא הסוף ולא האמצע, וזה ההבדל בין רכס למדרון.</w:t>
       </w:r>
@@ -690,7 +1055,7 @@
     <w:p>
       <w:pPr>
         <w:bidi/>
-        <w:spacing w:after="60"/>
+        <w:spacing w:after="120"/>
       </w:pPr>
       <w:r>
         <w:rPr>
@@ -698,22 +1063,10 @@
           <w:b/>
           <w:i w:val="0"/>
           <w:color w:val="111111"/>
-          <w:sz w:val="19"/>
+          <w:sz w:val="23"/>
           <w:rtl/>
           <w:bCs/>
-          <w:szCs w:val="19"/>
-        </w:rPr>
-        <w:t xml:space="preserve">הדימוי. </w:t>
-      </w:r>
-      <w:r>
-        <w:rPr>
-          <w:rFonts w:ascii="David" w:hAnsi="David" w:cs="David"/>
-          <w:b w:val="0"/>
-          <w:i w:val="0"/>
-          <w:color w:val="111111"/>
-          <w:sz w:val="19"/>
-          <w:rtl/>
-          <w:szCs w:val="19"/>
+          <w:szCs w:val="23"/>
         </w:rPr>
         <w:t>גג אחד רציף שעולה מקו המים אל הרכס, על בסיס אבן שנבלע בחול. קו הגג הוא קו הגובה.</w:t>
       </w:r>
@@ -721,18 +1074,64 @@
     <w:p>
       <w:pPr>
         <w:bidi/>
-        <w:spacing w:after="160"/>
-      </w:pPr>
-    </w:p>
-    <w:p>
-      <w:pPr>
-        <w:bidi/>
+        <w:spacing w:after="80"/>
       </w:pPr>
       <w:r>
         <w:drawing>
           <wp:inline xmlns:a="http://schemas.openxmlformats.org/drawingml/2006/main" xmlns:pic="http://schemas.openxmlformats.org/drawingml/2006/picture">
-            <wp:extent cx="2808000" cy="2808000"/>
-            <wp:docPr id="3" name="Picture 3"/>
+            <wp:extent cx="6696000" cy="1664489"/>
+            <wp:docPr id="10" name="Picture 10"/>
+            <wp:cNvGraphicFramePr>
+              <a:graphicFrameLocks noChangeAspect="1"/>
+            </wp:cNvGraphicFramePr>
+            <a:graphic>
+              <a:graphicData uri="http://schemas.openxmlformats.org/drawingml/2006/picture">
+                <pic:pic>
+                  <pic:nvPicPr>
+                    <pic:cNvPr id="0" name="band-05.png"/>
+                    <pic:cNvPicPr/>
+                  </pic:nvPicPr>
+                  <pic:blipFill>
+                    <a:blip r:embed="rId23"/>
+                    <a:stretch>
+                      <a:fillRect/>
+                    </a:stretch>
+                  </pic:blipFill>
+                  <pic:spPr>
+                    <a:xfrm>
+                      <a:off x="0" y="0"/>
+                      <a:ext cx="6696000" cy="1664489"/>
+                    </a:xfrm>
+                    <a:prstGeom prst="rect"/>
+                  </pic:spPr>
+                </pic:pic>
+              </a:graphicData>
+            </a:graphic>
+          </wp:inline>
+        </w:drawing>
+      </w:r>
+    </w:p>
+    <w:p>
+      <w:pPr>
+        <w:sectPr>
+          <w:headerReference w:type="default" r:id="rId21"/>
+          <w:pgSz w:w="11906" w:h="16838"/>
+          <w:pgMar w:top="680" w:right="680" w:bottom="680" w:left="680" w:header="0" w:footer="720" w:gutter="0"/>
+          <w:cols w:space="720"/>
+          <w:docGrid w:linePitch="360"/>
+        </w:sectPr>
+      </w:pPr>
+    </w:p>
+    <w:p>
+      <w:pPr>
+        <w:bidi/>
+        <w:spacing w:after="80"/>
+      </w:pPr>
+      <w:r>
+        <w:drawing>
+          <wp:inline xmlns:a="http://schemas.openxmlformats.org/drawingml/2006/main" xmlns:pic="http://schemas.openxmlformats.org/drawingml/2006/picture">
+            <wp:extent cx="4032000" cy="4032000"/>
+            <wp:docPr id="11" name="Picture 11"/>
             <wp:cNvGraphicFramePr>
               <a:graphicFrameLocks noChangeAspect="1"/>
             </wp:cNvGraphicFramePr>
@@ -744,7 +1143,7 @@
                     <pic:cNvPicPr/>
                   </pic:nvPicPr>
                   <pic:blipFill>
-                    <a:blip r:embed="rId15"/>
+                    <a:blip r:embed="rId25"/>
                     <a:stretch>
                       <a:fillRect/>
                     </a:stretch>
@@ -752,7 +1151,7 @@
                   <pic:spPr>
                     <a:xfrm>
                       <a:off x="0" y="0"/>
-                      <a:ext cx="2808000" cy="2808000"/>
+                      <a:ext cx="4032000" cy="4032000"/>
                     </a:xfrm>
                     <a:prstGeom prst="rect"/>
                   </pic:spPr>
@@ -766,7 +1165,7 @@
     <w:p>
       <w:pPr>
         <w:bidi/>
-        <w:spacing w:after="80"/>
+        <w:spacing w:after="120"/>
       </w:pPr>
       <w:r>
         <w:rPr>
@@ -788,6 +1187,24 @@
       </w:pPr>
       <w:r>
         <w:rPr>
+          <w:rFonts w:ascii="Arial" w:hAnsi="Arial" w:cs="Arial"/>
+          <w:b w:val="0"/>
+          <w:i w:val="0"/>
+          <w:color w:val="111111"/>
+          <w:sz w:val="52"/>
+          <w:rtl/>
+          <w:szCs w:val="52"/>
+        </w:rPr>
+        <w:t>02</w:t>
+      </w:r>
+    </w:p>
+    <w:p>
+      <w:pPr>
+        <w:bidi/>
+        <w:spacing w:after="0"/>
+      </w:pPr>
+      <w:r>
+        <w:rPr>
           <w:rFonts w:ascii="David" w:hAnsi="David" w:cs="David"/>
           <w:b/>
           <w:i w:val="0"/>
@@ -797,13 +1214,13 @@
           <w:bCs/>
           <w:szCs w:val="30"/>
         </w:rPr>
-        <w:t>02  קרשנדו של מגדלים</w:t>
+        <w:t>קרשנדו של מגדלים</w:t>
       </w:r>
     </w:p>
     <w:p>
       <w:pPr>
         <w:bidi/>
-        <w:spacing w:after="80"/>
+        <w:spacing w:after="120"/>
       </w:pPr>
       <w:r>
         <w:rPr>
@@ -821,7 +1238,7 @@
     <w:p>
       <w:pPr>
         <w:bidi/>
-        <w:spacing w:after="60"/>
+        <w:spacing w:after="80"/>
       </w:pPr>
       <w:r>
         <w:rPr>
@@ -829,10 +1246,10 @@
           <w:b/>
           <w:i w:val="0"/>
           <w:color w:val="111111"/>
-          <w:sz w:val="19"/>
+          <w:sz w:val="20"/>
           <w:rtl/>
           <w:bCs/>
-          <w:szCs w:val="19"/>
+          <w:szCs w:val="20"/>
         </w:rPr>
         <w:t xml:space="preserve">הנתונים. </w:t>
       </w:r>
@@ -842,9 +1259,9 @@
           <w:b w:val="0"/>
           <w:i w:val="0"/>
           <w:color w:val="111111"/>
-          <w:sz w:val="19"/>
+          <w:sz w:val="20"/>
           <w:rtl/>
-          <w:szCs w:val="19"/>
+          <w:szCs w:val="20"/>
         </w:rPr>
         <w:t>נפש לדונם לאורך חתך עירוני. העלייה תלולה והירידה מתונה: מרכז נבנה מהר יותר משהוא מתפוגג.</w:t>
       </w:r>
@@ -852,7 +1269,7 @@
     <w:p>
       <w:pPr>
         <w:bidi/>
-        <w:spacing w:after="60"/>
+        <w:spacing w:after="80"/>
       </w:pPr>
       <w:r>
         <w:rPr>
@@ -860,10 +1277,10 @@
           <w:b/>
           <w:i w:val="0"/>
           <w:color w:val="111111"/>
-          <w:sz w:val="19"/>
+          <w:sz w:val="20"/>
           <w:rtl/>
           <w:bCs/>
-          <w:szCs w:val="19"/>
+          <w:szCs w:val="20"/>
         </w:rPr>
         <w:t xml:space="preserve">הצליל. </w:t>
       </w:r>
@@ -873,9 +1290,9 @@
           <w:b w:val="0"/>
           <w:i w:val="0"/>
           <w:color w:val="111111"/>
-          <w:sz w:val="19"/>
+          <w:sz w:val="20"/>
           <w:rtl/>
-          <w:szCs w:val="19"/>
+          <w:szCs w:val="20"/>
         </w:rPr>
         <w:t>קשת אחת גדולה, והפסגה מגיעה קצת אחרי האמצע. הדרון מחזיק את המרכז גם כשהמנגינה יורדת.</w:t>
       </w:r>
@@ -883,7 +1300,7 @@
     <w:p>
       <w:pPr>
         <w:bidi/>
-        <w:spacing w:after="60"/>
+        <w:spacing w:after="120"/>
       </w:pPr>
       <w:r>
         <w:rPr>
@@ -891,22 +1308,10 @@
           <w:b/>
           <w:i w:val="0"/>
           <w:color w:val="111111"/>
-          <w:sz w:val="19"/>
+          <w:sz w:val="23"/>
           <w:rtl/>
           <w:bCs/>
-          <w:szCs w:val="19"/>
-        </w:rPr>
-        <w:t xml:space="preserve">הדימוי. </w:t>
-      </w:r>
-      <w:r>
-        <w:rPr>
-          <w:rFonts w:ascii="David" w:hAnsi="David" w:cs="David"/>
-          <w:b w:val="0"/>
-          <w:i w:val="0"/>
-          <w:color w:val="111111"/>
-          <w:sz w:val="19"/>
-          <w:rtl/>
-          <w:szCs w:val="19"/>
+          <w:szCs w:val="23"/>
         </w:rPr>
         <w:t>מגדלים שעולים מהקצוות אל שיא צפוף מעט אחרי האמצע, ונרגעים לטרסות. הצללית היא החתך.</w:t>
       </w:r>
@@ -914,13 +1319,47 @@
     <w:p>
       <w:pPr>
         <w:bidi/>
-        <w:spacing w:after="160"/>
-      </w:pPr>
+        <w:spacing w:after="80"/>
+      </w:pPr>
+      <w:r>
+        <w:drawing>
+          <wp:inline xmlns:a="http://schemas.openxmlformats.org/drawingml/2006/main" xmlns:pic="http://schemas.openxmlformats.org/drawingml/2006/picture">
+            <wp:extent cx="6696000" cy="1664489"/>
+            <wp:docPr id="12" name="Picture 12"/>
+            <wp:cNvGraphicFramePr>
+              <a:graphicFrameLocks noChangeAspect="1"/>
+            </wp:cNvGraphicFramePr>
+            <a:graphic>
+              <a:graphicData uri="http://schemas.openxmlformats.org/drawingml/2006/picture">
+                <pic:pic>
+                  <pic:nvPicPr>
+                    <pic:cNvPr id="0" name="band-06.png"/>
+                    <pic:cNvPicPr/>
+                  </pic:nvPicPr>
+                  <pic:blipFill>
+                    <a:blip r:embed="rId26"/>
+                    <a:stretch>
+                      <a:fillRect/>
+                    </a:stretch>
+                  </pic:blipFill>
+                  <pic:spPr>
+                    <a:xfrm>
+                      <a:off x="0" y="0"/>
+                      <a:ext cx="6696000" cy="1664489"/>
+                    </a:xfrm>
+                    <a:prstGeom prst="rect"/>
+                  </pic:spPr>
+                </pic:pic>
+              </a:graphicData>
+            </a:graphic>
+          </wp:inline>
+        </w:drawing>
+      </w:r>
     </w:p>
     <w:p>
       <w:pPr>
         <w:sectPr>
-          <w:headerReference w:type="default" r:id="rId13"/>
+          <w:headerReference w:type="default" r:id="rId24"/>
           <w:pgSz w:w="11906" w:h="16838"/>
           <w:pgMar w:top="680" w:right="680" w:bottom="680" w:left="680" w:header="0" w:footer="720" w:gutter="0"/>
           <w:cols w:space="720"/>
@@ -931,12 +1370,13 @@
     <w:p>
       <w:pPr>
         <w:bidi/>
+        <w:spacing w:after="80"/>
       </w:pPr>
       <w:r>
         <w:drawing>
           <wp:inline xmlns:a="http://schemas.openxmlformats.org/drawingml/2006/main" xmlns:pic="http://schemas.openxmlformats.org/drawingml/2006/picture">
-            <wp:extent cx="2808000" cy="2808000"/>
-            <wp:docPr id="4" name="Picture 4"/>
+            <wp:extent cx="4032000" cy="4032000"/>
+            <wp:docPr id="13" name="Picture 13"/>
             <wp:cNvGraphicFramePr>
               <a:graphicFrameLocks noChangeAspect="1"/>
             </wp:cNvGraphicFramePr>
@@ -948,7 +1388,7 @@
                     <pic:cNvPicPr/>
                   </pic:nvPicPr>
                   <pic:blipFill>
-                    <a:blip r:embed="rId17"/>
+                    <a:blip r:embed="rId28"/>
                     <a:stretch>
                       <a:fillRect/>
                     </a:stretch>
@@ -956,7 +1396,7 @@
                   <pic:spPr>
                     <a:xfrm>
                       <a:off x="0" y="0"/>
-                      <a:ext cx="2808000" cy="2808000"/>
+                      <a:ext cx="4032000" cy="4032000"/>
                     </a:xfrm>
                     <a:prstGeom prst="rect"/>
                   </pic:spPr>
@@ -970,14 +1410,14 @@
     <w:p>
       <w:pPr>
         <w:bidi/>
-        <w:spacing w:after="80"/>
+        <w:spacing w:after="120"/>
       </w:pPr>
       <w:r>
         <w:rPr>
           <w:rFonts w:ascii="Arial" w:hAnsi="Arial" w:cs="Arial"/>
           <w:b w:val="0"/>
           <w:i w:val="0"/>
-          <w:color w:val="A3A3A3"/>
+          <w:color w:val="707070"/>
           <w:sz w:val="14"/>
           <w:rtl/>
           <w:szCs w:val="14"/>
@@ -992,29 +1432,47 @@
       </w:pPr>
       <w:r>
         <w:rPr>
+          <w:rFonts w:ascii="Arial" w:hAnsi="Arial" w:cs="Arial"/>
+          <w:b w:val="0"/>
+          <w:i w:val="0"/>
+          <w:color w:val="111111"/>
+          <w:sz w:val="52"/>
+          <w:rtl/>
+          <w:szCs w:val="52"/>
+        </w:rPr>
+        <w:t>03</w:t>
+      </w:r>
+    </w:p>
+    <w:p>
+      <w:pPr>
+        <w:bidi/>
+        <w:spacing w:after="0"/>
+      </w:pPr>
+      <w:r>
+        <w:rPr>
           <w:rFonts w:ascii="David" w:hAnsi="David" w:cs="David"/>
           <w:b/>
           <w:i w:val="0"/>
-          <w:color w:val="F2F2F2"/>
+          <w:color w:val="111111"/>
           <w:sz w:val="30"/>
           <w:rtl/>
           <w:bCs/>
           <w:szCs w:val="30"/>
         </w:rPr>
-        <w:t>03  שתי שעות שיא</w:t>
+        <w:t>שתי שעות שיא</w:t>
       </w:r>
     </w:p>
     <w:p>
       <w:pPr>
         <w:bidi/>
-        <w:spacing w:after="80"/>
+        <w:spacing w:after="120"/>
       </w:pPr>
       <w:r>
         <w:rPr>
           <w:rFonts w:ascii="Arial" w:hAnsi="Arial" w:cs="Arial"/>
           <w:b w:val="0"/>
           <w:i w:val="0"/>
-          <w:color w:val="A3A3A3"/>
+          <w:color w:val="707070"/>
           <w:sz w:val="14"/>
           <w:rtl/>
           <w:szCs w:val="14"/>
@@ -1025,18 +1483,18 @@
     <w:p>
       <w:pPr>
         <w:bidi/>
-        <w:spacing w:after="60"/>
+        <w:spacing w:after="80"/>
       </w:pPr>
       <w:r>
         <w:rPr>
           <w:rFonts w:ascii="David" w:hAnsi="David" w:cs="David"/>
           <w:b/>
           <w:i w:val="0"/>
-          <w:color w:val="F2F2F2"/>
-          <w:sz w:val="19"/>
+          <w:color w:val="111111"/>
+          <w:sz w:val="20"/>
           <w:rtl/>
           <w:bCs/>
-          <w:szCs w:val="19"/>
+          <w:szCs w:val="20"/>
         </w:rPr>
         <w:t xml:space="preserve">הנתונים. </w:t>
       </w:r>
@@ -1045,10 +1503,10 @@
           <w:rFonts w:ascii="David" w:hAnsi="David" w:cs="David"/>
           <w:b w:val="0"/>
           <w:i w:val="0"/>
-          <w:color w:val="F2F2F2"/>
-          <w:sz w:val="19"/>
+          <w:color w:val="111111"/>
+          <w:sz w:val="20"/>
           <w:rtl/>
-          <w:szCs w:val="19"/>
+          <w:szCs w:val="20"/>
         </w:rPr>
         <w:t>נפח תנועה לפי שעה בצומת. שני גלים, יציאה לעבודה וחזרה, ושקע צהריים ביניהם.</w:t>
       </w:r>
@@ -1056,18 +1514,18 @@
     <w:p>
       <w:pPr>
         <w:bidi/>
-        <w:spacing w:after="60"/>
+        <w:spacing w:after="80"/>
       </w:pPr>
       <w:r>
         <w:rPr>
           <w:rFonts w:ascii="David" w:hAnsi="David" w:cs="David"/>
           <w:b/>
           <w:i w:val="0"/>
-          <w:color w:val="F2F2F2"/>
-          <w:sz w:val="19"/>
+          <w:color w:val="111111"/>
+          <w:sz w:val="20"/>
           <w:rtl/>
           <w:bCs/>
-          <w:szCs w:val="19"/>
+          <w:szCs w:val="20"/>
         </w:rPr>
         <w:t xml:space="preserve">הצליל. </w:t>
       </w:r>
@@ -1076,10 +1534,10 @@
           <w:rFonts w:ascii="David" w:hAnsi="David" w:cs="David"/>
           <w:b w:val="0"/>
           <w:i w:val="0"/>
-          <w:color w:val="F2F2F2"/>
-          <w:sz w:val="19"/>
+          <w:color w:val="111111"/>
+          <w:sz w:val="20"/>
           <w:rtl/>
-          <w:szCs w:val="19"/>
+          <w:szCs w:val="20"/>
         </w:rPr>
         <w:t>המוטיב חוזר פעמיים כמעט זהה. הקצב מתפוצץ בדיוק בשעות שבהן העומס נבנה ומתפרק.</w:t>
       </w:r>
@@ -1087,30 +1545,18 @@
     <w:p>
       <w:pPr>
         <w:bidi/>
-        <w:spacing w:after="60"/>
+        <w:spacing w:after="120"/>
       </w:pPr>
       <w:r>
         <w:rPr>
           <w:rFonts w:ascii="David" w:hAnsi="David" w:cs="David"/>
           <w:b/>
           <w:i w:val="0"/>
-          <w:color w:val="F2F2F2"/>
-          <w:sz w:val="19"/>
+          <w:color w:val="111111"/>
+          <w:sz w:val="23"/>
           <w:rtl/>
           <w:bCs/>
-          <w:szCs w:val="19"/>
-        </w:rPr>
-        <w:t xml:space="preserve">הדימוי. </w:t>
-      </w:r>
-      <w:r>
-        <w:rPr>
-          <w:rFonts w:ascii="David" w:hAnsi="David" w:cs="David"/>
-          <w:b w:val="0"/>
-          <w:i w:val="0"/>
-          <w:color w:val="F2F2F2"/>
-          <w:sz w:val="19"/>
-          <w:rtl/>
-          <w:szCs w:val="19"/>
+          <w:szCs w:val="23"/>
         </w:rPr>
         <w:t>שתי קמרונות זהות מעל צומת ושקע ביניהן. עקבות האור הם הזרימה שהנתונים סופרים.</w:t>
       </w:r>
@@ -1118,18 +1564,64 @@
     <w:p>
       <w:pPr>
         <w:bidi/>
-        <w:spacing w:after="160"/>
-      </w:pPr>
-    </w:p>
-    <w:p>
-      <w:pPr>
-        <w:bidi/>
+        <w:spacing w:after="80"/>
       </w:pPr>
       <w:r>
         <w:drawing>
           <wp:inline xmlns:a="http://schemas.openxmlformats.org/drawingml/2006/main" xmlns:pic="http://schemas.openxmlformats.org/drawingml/2006/picture">
-            <wp:extent cx="2808000" cy="2808000"/>
-            <wp:docPr id="5" name="Picture 5"/>
+            <wp:extent cx="6696000" cy="1664489"/>
+            <wp:docPr id="14" name="Picture 14"/>
+            <wp:cNvGraphicFramePr>
+              <a:graphicFrameLocks noChangeAspect="1"/>
+            </wp:cNvGraphicFramePr>
+            <a:graphic>
+              <a:graphicData uri="http://schemas.openxmlformats.org/drawingml/2006/picture">
+                <pic:pic>
+                  <pic:nvPicPr>
+                    <pic:cNvPr id="0" name="band-07.png"/>
+                    <pic:cNvPicPr/>
+                  </pic:nvPicPr>
+                  <pic:blipFill>
+                    <a:blip r:embed="rId29"/>
+                    <a:stretch>
+                      <a:fillRect/>
+                    </a:stretch>
+                  </pic:blipFill>
+                  <pic:spPr>
+                    <a:xfrm>
+                      <a:off x="0" y="0"/>
+                      <a:ext cx="6696000" cy="1664489"/>
+                    </a:xfrm>
+                    <a:prstGeom prst="rect"/>
+                  </pic:spPr>
+                </pic:pic>
+              </a:graphicData>
+            </a:graphic>
+          </wp:inline>
+        </w:drawing>
+      </w:r>
+    </w:p>
+    <w:p>
+      <w:pPr>
+        <w:sectPr>
+          <w:headerReference w:type="default" r:id="rId27"/>
+          <w:pgSz w:w="11906" w:h="16838"/>
+          <w:pgMar w:top="680" w:right="680" w:bottom="680" w:left="680" w:header="0" w:footer="720" w:gutter="0"/>
+          <w:cols w:space="720"/>
+          <w:docGrid w:linePitch="360"/>
+        </w:sectPr>
+      </w:pPr>
+    </w:p>
+    <w:p>
+      <w:pPr>
+        <w:bidi/>
+        <w:spacing w:after="80"/>
+      </w:pPr>
+      <w:r>
+        <w:drawing>
+          <wp:inline xmlns:a="http://schemas.openxmlformats.org/drawingml/2006/main" xmlns:pic="http://schemas.openxmlformats.org/drawingml/2006/picture">
+            <wp:extent cx="4032000" cy="4032000"/>
+            <wp:docPr id="15" name="Picture 15"/>
             <wp:cNvGraphicFramePr>
               <a:graphicFrameLocks noChangeAspect="1"/>
             </wp:cNvGraphicFramePr>
@@ -1141,7 +1633,7 @@
                     <pic:cNvPicPr/>
                   </pic:nvPicPr>
                   <pic:blipFill>
-                    <a:blip r:embed="rId18"/>
+                    <a:blip r:embed="rId31"/>
                     <a:stretch>
                       <a:fillRect/>
                     </a:stretch>
@@ -1149,7 +1641,7 @@
                   <pic:spPr>
                     <a:xfrm>
                       <a:off x="0" y="0"/>
-                      <a:ext cx="2808000" cy="2808000"/>
+                      <a:ext cx="4032000" cy="4032000"/>
                     </a:xfrm>
                     <a:prstGeom prst="rect"/>
                   </pic:spPr>
@@ -1163,14 +1655,14 @@
     <w:p>
       <w:pPr>
         <w:bidi/>
-        <w:spacing w:after="80"/>
+        <w:spacing w:after="120"/>
       </w:pPr>
       <w:r>
         <w:rPr>
           <w:rFonts w:ascii="Arial" w:hAnsi="Arial" w:cs="Arial"/>
           <w:b w:val="0"/>
           <w:i w:val="0"/>
-          <w:color w:val="A3A3A3"/>
+          <w:color w:val="707070"/>
           <w:sz w:val="14"/>
           <w:rtl/>
           <w:szCs w:val="14"/>
@@ -1185,29 +1677,47 @@
       </w:pPr>
       <w:r>
         <w:rPr>
+          <w:rFonts w:ascii="Arial" w:hAnsi="Arial" w:cs="Arial"/>
+          <w:b w:val="0"/>
+          <w:i w:val="0"/>
+          <w:color w:val="111111"/>
+          <w:sz w:val="52"/>
+          <w:rtl/>
+          <w:szCs w:val="52"/>
+        </w:rPr>
+        <w:t>04</w:t>
+      </w:r>
+    </w:p>
+    <w:p>
+      <w:pPr>
+        <w:bidi/>
+        <w:spacing w:after="0"/>
+      </w:pPr>
+      <w:r>
+        <w:rPr>
           <w:rFonts w:ascii="David" w:hAnsi="David" w:cs="David"/>
           <w:b/>
           <w:i w:val="0"/>
-          <w:color w:val="F2F2F2"/>
+          <w:color w:val="111111"/>
           <w:sz w:val="30"/>
           <w:rtl/>
           <w:bCs/>
           <w:szCs w:val="30"/>
         </w:rPr>
-        <w:t>04  רחוב של זכוכית</w:t>
+        <w:t>רחוב של זכוכית</w:t>
       </w:r>
     </w:p>
     <w:p>
       <w:pPr>
         <w:bidi/>
-        <w:spacing w:after="80"/>
+        <w:spacing w:after="120"/>
       </w:pPr>
       <w:r>
         <w:rPr>
           <w:rFonts w:ascii="Arial" w:hAnsi="Arial" w:cs="Arial"/>
           <w:b w:val="0"/>
           <w:i w:val="0"/>
-          <w:color w:val="A3A3A3"/>
+          <w:color w:val="707070"/>
           <w:sz w:val="14"/>
           <w:rtl/>
           <w:szCs w:val="14"/>
@@ -1218,18 +1728,18 @@
     <w:p>
       <w:pPr>
         <w:bidi/>
-        <w:spacing w:after="60"/>
+        <w:spacing w:after="80"/>
       </w:pPr>
       <w:r>
         <w:rPr>
           <w:rFonts w:ascii="David" w:hAnsi="David" w:cs="David"/>
           <w:b/>
           <w:i w:val="0"/>
-          <w:color w:val="F2F2F2"/>
-          <w:sz w:val="19"/>
+          <w:color w:val="111111"/>
+          <w:sz w:val="20"/>
           <w:rtl/>
           <w:bCs/>
-          <w:szCs w:val="19"/>
+          <w:szCs w:val="20"/>
         </w:rPr>
         <w:t xml:space="preserve">הנתונים. </w:t>
       </w:r>
@@ -1238,10 +1748,10 @@
           <w:rFonts w:ascii="David" w:hAnsi="David" w:cs="David"/>
           <w:b w:val="0"/>
           <w:i w:val="0"/>
-          <w:color w:val="F2F2F2"/>
-          <w:sz w:val="19"/>
+          <w:color w:val="111111"/>
+          <w:sz w:val="20"/>
           <w:rtl/>
-          <w:szCs w:val="19"/>
+          <w:szCs w:val="20"/>
         </w:rPr>
         <w:t>מספר קומות לאורך רחוב. אין מגמה, יש שכנות: כל ערך הוא בניין אחר.</w:t>
       </w:r>
@@ -1249,18 +1759,18 @@
     <w:p>
       <w:pPr>
         <w:bidi/>
-        <w:spacing w:after="60"/>
+        <w:spacing w:after="80"/>
       </w:pPr>
       <w:r>
         <w:rPr>
           <w:rFonts w:ascii="David" w:hAnsi="David" w:cs="David"/>
           <w:b/>
           <w:i w:val="0"/>
-          <w:color w:val="F2F2F2"/>
-          <w:sz w:val="19"/>
+          <w:color w:val="111111"/>
+          <w:sz w:val="20"/>
           <w:rtl/>
           <w:bCs/>
-          <w:szCs w:val="19"/>
+          <w:szCs w:val="20"/>
         </w:rPr>
         <w:t xml:space="preserve">הצליל. </w:t>
       </w:r>
@@ -1269,10 +1779,10 @@
           <w:rFonts w:ascii="David" w:hAnsi="David" w:cs="David"/>
           <w:b w:val="0"/>
           <w:i w:val="0"/>
-          <w:color w:val="F2F2F2"/>
-          <w:sz w:val="19"/>
+          <w:color w:val="111111"/>
+          <w:sz w:val="20"/>
           <w:rtl/>
-          <w:szCs w:val="19"/>
+          <w:szCs w:val="20"/>
         </w:rPr>
         <w:t>המאגר המקוטע ביותר בסדרה. כל מגדל הוא חבטה, ופעמוני זכוכית הופכים כל קפיצה לנקודה בודדת.</w:t>
       </w:r>
@@ -1280,30 +1790,18 @@
     <w:p>
       <w:pPr>
         <w:bidi/>
-        <w:spacing w:after="60"/>
+        <w:spacing w:after="120"/>
       </w:pPr>
       <w:r>
         <w:rPr>
           <w:rFonts w:ascii="David" w:hAnsi="David" w:cs="David"/>
           <w:b/>
           <w:i w:val="0"/>
-          <w:color w:val="F2F2F2"/>
-          <w:sz w:val="19"/>
+          <w:color w:val="111111"/>
+          <w:sz w:val="23"/>
           <w:rtl/>
           <w:bCs/>
-          <w:szCs w:val="19"/>
-        </w:rPr>
-        <w:t xml:space="preserve">הדימוי. </w:t>
-      </w:r>
-      <w:r>
-        <w:rPr>
-          <w:rFonts w:ascii="David" w:hAnsi="David" w:cs="David"/>
-          <w:b w:val="0"/>
-          <w:i w:val="0"/>
-          <w:color w:val="F2F2F2"/>
-          <w:sz w:val="19"/>
-          <w:rtl/>
-          <w:szCs w:val="19"/>
+          <w:szCs w:val="23"/>
         </w:rPr>
         <w:t>מנסרות זכוכית בגבהים שונים לגמרי, צמודות זו לזו. כל קפיצה בגובה היא חבטה בקצב.</w:t>
       </w:r>
@@ -1311,13 +1809,47 @@
     <w:p>
       <w:pPr>
         <w:bidi/>
-        <w:spacing w:after="160"/>
-      </w:pPr>
+        <w:spacing w:after="80"/>
+      </w:pPr>
+      <w:r>
+        <w:drawing>
+          <wp:inline xmlns:a="http://schemas.openxmlformats.org/drawingml/2006/main" xmlns:pic="http://schemas.openxmlformats.org/drawingml/2006/picture">
+            <wp:extent cx="6696000" cy="1664489"/>
+            <wp:docPr id="16" name="Picture 16"/>
+            <wp:cNvGraphicFramePr>
+              <a:graphicFrameLocks noChangeAspect="1"/>
+            </wp:cNvGraphicFramePr>
+            <a:graphic>
+              <a:graphicData uri="http://schemas.openxmlformats.org/drawingml/2006/picture">
+                <pic:pic>
+                  <pic:nvPicPr>
+                    <pic:cNvPr id="0" name="band-08.png"/>
+                    <pic:cNvPicPr/>
+                  </pic:nvPicPr>
+                  <pic:blipFill>
+                    <a:blip r:embed="rId32"/>
+                    <a:stretch>
+                      <a:fillRect/>
+                    </a:stretch>
+                  </pic:blipFill>
+                  <pic:spPr>
+                    <a:xfrm>
+                      <a:off x="0" y="0"/>
+                      <a:ext cx="6696000" cy="1664489"/>
+                    </a:xfrm>
+                    <a:prstGeom prst="rect"/>
+                  </pic:spPr>
+                </pic:pic>
+              </a:graphicData>
+            </a:graphic>
+          </wp:inline>
+        </w:drawing>
+      </w:r>
     </w:p>
     <w:p>
       <w:pPr>
         <w:sectPr>
-          <w:headerReference w:type="default" r:id="rId16"/>
+          <w:headerReference w:type="default" r:id="rId30"/>
           <w:pgSz w:w="11906" w:h="16838"/>
           <w:pgMar w:top="680" w:right="680" w:bottom="680" w:left="680" w:header="0" w:footer="720" w:gutter="0"/>
           <w:cols w:space="720"/>
@@ -1328,12 +1860,13 @@
     <w:p>
       <w:pPr>
         <w:bidi/>
+        <w:spacing w:after="80"/>
       </w:pPr>
       <w:r>
         <w:drawing>
           <wp:inline xmlns:a="http://schemas.openxmlformats.org/drawingml/2006/main" xmlns:pic="http://schemas.openxmlformats.org/drawingml/2006/picture">
-            <wp:extent cx="2808000" cy="2808000"/>
-            <wp:docPr id="6" name="Picture 6"/>
+            <wp:extent cx="4032000" cy="4032000"/>
+            <wp:docPr id="17" name="Picture 17"/>
             <wp:cNvGraphicFramePr>
               <a:graphicFrameLocks noChangeAspect="1"/>
             </wp:cNvGraphicFramePr>
@@ -1345,7 +1878,7 @@
                     <pic:cNvPicPr/>
                   </pic:nvPicPr>
                   <pic:blipFill>
-                    <a:blip r:embed="rId20"/>
+                    <a:blip r:embed="rId34"/>
                     <a:stretch>
                       <a:fillRect/>
                     </a:stretch>
@@ -1353,7 +1886,7 @@
                   <pic:spPr>
                     <a:xfrm>
                       <a:off x="0" y="0"/>
-                      <a:ext cx="2808000" cy="2808000"/>
+                      <a:ext cx="4032000" cy="4032000"/>
                     </a:xfrm>
                     <a:prstGeom prst="rect"/>
                   </pic:spPr>
@@ -1367,14 +1900,14 @@
     <w:p>
       <w:pPr>
         <w:bidi/>
-        <w:spacing w:after="80"/>
+        <w:spacing w:after="120"/>
       </w:pPr>
       <w:r>
         <w:rPr>
           <w:rFonts w:ascii="Arial" w:hAnsi="Arial" w:cs="Arial"/>
           <w:b w:val="0"/>
           <w:i w:val="0"/>
-          <w:color w:val="A3A3A3"/>
+          <w:color w:val="707070"/>
           <w:sz w:val="14"/>
           <w:rtl/>
           <w:szCs w:val="14"/>
@@ -1389,29 +1922,47 @@
       </w:pPr>
       <w:r>
         <w:rPr>
+          <w:rFonts w:ascii="Arial" w:hAnsi="Arial" w:cs="Arial"/>
+          <w:b w:val="0"/>
+          <w:i w:val="0"/>
+          <w:color w:val="111111"/>
+          <w:sz w:val="52"/>
+          <w:rtl/>
+          <w:szCs w:val="52"/>
+        </w:rPr>
+        <w:t>05</w:t>
+      </w:r>
+    </w:p>
+    <w:p>
+      <w:pPr>
+        <w:bidi/>
+        <w:spacing w:after="0"/>
+      </w:pPr>
+      <w:r>
+        <w:rPr>
           <w:rFonts w:ascii="David" w:hAnsi="David" w:cs="David"/>
           <w:b/>
           <w:i w:val="0"/>
-          <w:color w:val="F2F2F2"/>
+          <w:color w:val="111111"/>
           <w:sz w:val="30"/>
           <w:rtl/>
           <w:bCs/>
           <w:szCs w:val="30"/>
         </w:rPr>
-        <w:t>05  ספירלת הגדילה</w:t>
+        <w:t>ספירלת הגדילה</w:t>
       </w:r>
     </w:p>
     <w:p>
       <w:pPr>
         <w:bidi/>
-        <w:spacing w:after="80"/>
+        <w:spacing w:after="120"/>
       </w:pPr>
       <w:r>
         <w:rPr>
           <w:rFonts w:ascii="Arial" w:hAnsi="Arial" w:cs="Arial"/>
           <w:b w:val="0"/>
           <w:i w:val="0"/>
-          <w:color w:val="A3A3A3"/>
+          <w:color w:val="707070"/>
           <w:sz w:val="14"/>
           <w:rtl/>
           <w:szCs w:val="14"/>
@@ -1422,18 +1973,18 @@
     <w:p>
       <w:pPr>
         <w:bidi/>
-        <w:spacing w:after="60"/>
+        <w:spacing w:after="80"/>
       </w:pPr>
       <w:r>
         <w:rPr>
           <w:rFonts w:ascii="David" w:hAnsi="David" w:cs="David"/>
           <w:b/>
           <w:i w:val="0"/>
-          <w:color w:val="F2F2F2"/>
-          <w:sz w:val="19"/>
+          <w:color w:val="111111"/>
+          <w:sz w:val="20"/>
           <w:rtl/>
           <w:bCs/>
-          <w:szCs w:val="19"/>
+          <w:szCs w:val="20"/>
         </w:rPr>
         <w:t xml:space="preserve">הנתונים. </w:t>
       </w:r>
@@ -1442,10 +1993,10 @@
           <w:rFonts w:ascii="David" w:hAnsi="David" w:cs="David"/>
           <w:b w:val="0"/>
           <w:i w:val="0"/>
-          <w:color w:val="F2F2F2"/>
-          <w:sz w:val="19"/>
+          <w:color w:val="111111"/>
+          <w:sz w:val="20"/>
           <w:rtl/>
-          <w:szCs w:val="19"/>
+          <w:szCs w:val="20"/>
         </w:rPr>
         <w:t>אלפי תושבים, שנה אחר שנה. אין שיא, יש כיוון אחד שנעשה תלול יותר בשליש האחרון.</w:t>
       </w:r>
@@ -1453,18 +2004,18 @@
     <w:p>
       <w:pPr>
         <w:bidi/>
-        <w:spacing w:after="60"/>
+        <w:spacing w:after="80"/>
       </w:pPr>
       <w:r>
         <w:rPr>
           <w:rFonts w:ascii="David" w:hAnsi="David" w:cs="David"/>
           <w:b/>
           <w:i w:val="0"/>
-          <w:color w:val="F2F2F2"/>
-          <w:sz w:val="19"/>
+          <w:color w:val="111111"/>
+          <w:sz w:val="20"/>
           <w:rtl/>
           <w:bCs/>
-          <w:szCs w:val="19"/>
+          <w:szCs w:val="20"/>
         </w:rPr>
         <w:t xml:space="preserve">הצליל. </w:t>
       </w:r>
@@ -1473,10 +2024,10 @@
           <w:rFonts w:ascii="David" w:hAnsi="David" w:cs="David"/>
           <w:b w:val="0"/>
           <w:i w:val="0"/>
-          <w:color w:val="F2F2F2"/>
-          <w:sz w:val="19"/>
+          <w:color w:val="111111"/>
+          <w:sz w:val="20"/>
           <w:rtl/>
-          <w:szCs w:val="19"/>
+          <w:szCs w:val="20"/>
         </w:rPr>
         <w:t>המנגינה כמעט לא יורדת. הקצב דליל, כי אין כאן נקודות מפנה, רק האצה.</w:t>
       </w:r>
@@ -1484,30 +2035,18 @@
     <w:p>
       <w:pPr>
         <w:bidi/>
-        <w:spacing w:after="60"/>
+        <w:spacing w:after="120"/>
       </w:pPr>
       <w:r>
         <w:rPr>
           <w:rFonts w:ascii="David" w:hAnsi="David" w:cs="David"/>
           <w:b/>
           <w:i w:val="0"/>
-          <w:color w:val="F2F2F2"/>
-          <w:sz w:val="19"/>
+          <w:color w:val="111111"/>
+          <w:sz w:val="23"/>
           <w:rtl/>
           <w:bCs/>
-          <w:szCs w:val="19"/>
-        </w:rPr>
-        <w:t xml:space="preserve">הדימוי. </w:t>
-      </w:r>
-      <w:r>
-        <w:rPr>
-          <w:rFonts w:ascii="David" w:hAnsi="David" w:cs="David"/>
-          <w:b w:val="0"/>
-          <w:i w:val="0"/>
-          <w:color w:val="F2F2F2"/>
-          <w:sz w:val="19"/>
-          <w:rtl/>
-          <w:szCs w:val="19"/>
+          <w:szCs w:val="23"/>
         </w:rPr>
         <w:t>מגדל שגדל ברמפה רציפה, כל סיבוב רחב מקודמו. הצמחייה נשפכת מכל קומה.</w:t>
       </w:r>
@@ -1515,18 +2054,64 @@
     <w:p>
       <w:pPr>
         <w:bidi/>
-        <w:spacing w:after="160"/>
-      </w:pPr>
-    </w:p>
-    <w:p>
-      <w:pPr>
-        <w:bidi/>
+        <w:spacing w:after="80"/>
       </w:pPr>
       <w:r>
         <w:drawing>
           <wp:inline xmlns:a="http://schemas.openxmlformats.org/drawingml/2006/main" xmlns:pic="http://schemas.openxmlformats.org/drawingml/2006/picture">
-            <wp:extent cx="2808000" cy="2808000"/>
-            <wp:docPr id="7" name="Picture 7"/>
+            <wp:extent cx="6696000" cy="1664489"/>
+            <wp:docPr id="18" name="Picture 18"/>
+            <wp:cNvGraphicFramePr>
+              <a:graphicFrameLocks noChangeAspect="1"/>
+            </wp:cNvGraphicFramePr>
+            <a:graphic>
+              <a:graphicData uri="http://schemas.openxmlformats.org/drawingml/2006/picture">
+                <pic:pic>
+                  <pic:nvPicPr>
+                    <pic:cNvPr id="0" name="band-09.png"/>
+                    <pic:cNvPicPr/>
+                  </pic:nvPicPr>
+                  <pic:blipFill>
+                    <a:blip r:embed="rId35"/>
+                    <a:stretch>
+                      <a:fillRect/>
+                    </a:stretch>
+                  </pic:blipFill>
+                  <pic:spPr>
+                    <a:xfrm>
+                      <a:off x="0" y="0"/>
+                      <a:ext cx="6696000" cy="1664489"/>
+                    </a:xfrm>
+                    <a:prstGeom prst="rect"/>
+                  </pic:spPr>
+                </pic:pic>
+              </a:graphicData>
+            </a:graphic>
+          </wp:inline>
+        </w:drawing>
+      </w:r>
+    </w:p>
+    <w:p>
+      <w:pPr>
+        <w:sectPr>
+          <w:headerReference w:type="default" r:id="rId33"/>
+          <w:pgSz w:w="11906" w:h="16838"/>
+          <w:pgMar w:top="680" w:right="680" w:bottom="680" w:left="680" w:header="0" w:footer="720" w:gutter="0"/>
+          <w:cols w:space="720"/>
+          <w:docGrid w:linePitch="360"/>
+        </w:sectPr>
+      </w:pPr>
+    </w:p>
+    <w:p>
+      <w:pPr>
+        <w:bidi/>
+        <w:spacing w:after="80"/>
+      </w:pPr>
+      <w:r>
+        <w:drawing>
+          <wp:inline xmlns:a="http://schemas.openxmlformats.org/drawingml/2006/main" xmlns:pic="http://schemas.openxmlformats.org/drawingml/2006/picture">
+            <wp:extent cx="4032000" cy="4032000"/>
+            <wp:docPr id="19" name="Picture 19"/>
             <wp:cNvGraphicFramePr>
               <a:graphicFrameLocks noChangeAspect="1"/>
             </wp:cNvGraphicFramePr>
@@ -1538,7 +2123,7 @@
                     <pic:cNvPicPr/>
                   </pic:nvPicPr>
                   <pic:blipFill>
-                    <a:blip r:embed="rId21"/>
+                    <a:blip r:embed="rId37"/>
                     <a:stretch>
                       <a:fillRect/>
                     </a:stretch>
@@ -1546,7 +2131,7 @@
                   <pic:spPr>
                     <a:xfrm>
                       <a:off x="0" y="0"/>
-                      <a:ext cx="2808000" cy="2808000"/>
+                      <a:ext cx="4032000" cy="4032000"/>
                     </a:xfrm>
                     <a:prstGeom prst="rect"/>
                   </pic:spPr>
@@ -1560,14 +2145,14 @@
     <w:p>
       <w:pPr>
         <w:bidi/>
-        <w:spacing w:after="80"/>
+        <w:spacing w:after="120"/>
       </w:pPr>
       <w:r>
         <w:rPr>
           <w:rFonts w:ascii="Arial" w:hAnsi="Arial" w:cs="Arial"/>
           <w:b w:val="0"/>
           <w:i w:val="0"/>
-          <w:color w:val="A3A3A3"/>
+          <w:color w:val="707070"/>
           <w:sz w:val="14"/>
           <w:rtl/>
           <w:szCs w:val="14"/>
@@ -1582,29 +2167,47 @@
       </w:pPr>
       <w:r>
         <w:rPr>
+          <w:rFonts w:ascii="Arial" w:hAnsi="Arial" w:cs="Arial"/>
+          <w:b w:val="0"/>
+          <w:i w:val="0"/>
+          <w:color w:val="111111"/>
+          <w:sz w:val="52"/>
+          <w:rtl/>
+          <w:szCs w:val="52"/>
+        </w:rPr>
+        <w:t>06</w:t>
+      </w:r>
+    </w:p>
+    <w:p>
+      <w:pPr>
+        <w:bidi/>
+        <w:spacing w:after="0"/>
+      </w:pPr>
+      <w:r>
+        <w:rPr>
           <w:rFonts w:ascii="David" w:hAnsi="David" w:cs="David"/>
           <w:b/>
           <w:i w:val="0"/>
-          <w:color w:val="F2F2F2"/>
+          <w:color w:val="111111"/>
           <w:sz w:val="30"/>
           <w:rtl/>
           <w:bCs/>
           <w:szCs w:val="30"/>
         </w:rPr>
-        <w:t>06  הגג שהפך לפארק</w:t>
+        <w:t>הגג שהפך לפארק</w:t>
       </w:r>
     </w:p>
     <w:p>
       <w:pPr>
         <w:bidi/>
-        <w:spacing w:after="80"/>
+        <w:spacing w:after="120"/>
       </w:pPr>
       <w:r>
         <w:rPr>
           <w:rFonts w:ascii="Arial" w:hAnsi="Arial" w:cs="Arial"/>
           <w:b w:val="0"/>
           <w:i w:val="0"/>
-          <w:color w:val="A3A3A3"/>
+          <w:color w:val="707070"/>
           <w:sz w:val="14"/>
           <w:rtl/>
           <w:szCs w:val="14"/>
@@ -1615,18 +2218,18 @@
     <w:p>
       <w:pPr>
         <w:bidi/>
-        <w:spacing w:after="60"/>
+        <w:spacing w:after="80"/>
       </w:pPr>
       <w:r>
         <w:rPr>
           <w:rFonts w:ascii="David" w:hAnsi="David" w:cs="David"/>
           <w:b/>
           <w:i w:val="0"/>
-          <w:color w:val="F2F2F2"/>
-          <w:sz w:val="19"/>
+          <w:color w:val="111111"/>
+          <w:sz w:val="20"/>
           <w:rtl/>
           <w:bCs/>
-          <w:szCs w:val="19"/>
+          <w:szCs w:val="20"/>
         </w:rPr>
         <w:t xml:space="preserve">הנתונים. </w:t>
       </w:r>
@@ -1635,10 +2238,10 @@
           <w:rFonts w:ascii="David" w:hAnsi="David" w:cs="David"/>
           <w:b w:val="0"/>
           <w:i w:val="0"/>
-          <w:color w:val="F2F2F2"/>
-          <w:sz w:val="19"/>
+          <w:color w:val="111111"/>
+          <w:sz w:val="20"/>
           <w:rtl/>
-          <w:szCs w:val="19"/>
+          <w:szCs w:val="20"/>
         </w:rPr>
         <w:t>אחוז כיסוי ירוק לאורך חתך. הפארק לא מתחיל בגדר, הוא נבנה בהדרגה.</w:t>
       </w:r>
@@ -1646,18 +2249,18 @@
     <w:p>
       <w:pPr>
         <w:bidi/>
-        <w:spacing w:after="60"/>
+        <w:spacing w:after="80"/>
       </w:pPr>
       <w:r>
         <w:rPr>
           <w:rFonts w:ascii="David" w:hAnsi="David" w:cs="David"/>
           <w:b/>
           <w:i w:val="0"/>
-          <w:color w:val="F2F2F2"/>
-          <w:sz w:val="19"/>
+          <w:color w:val="111111"/>
+          <w:sz w:val="20"/>
           <w:rtl/>
           <w:bCs/>
-          <w:szCs w:val="19"/>
+          <w:szCs w:val="20"/>
         </w:rPr>
         <w:t xml:space="preserve">הצליל. </w:t>
       </w:r>
@@ -1666,10 +2269,10 @@
           <w:rFonts w:ascii="David" w:hAnsi="David" w:cs="David"/>
           <w:b w:val="0"/>
           <w:i w:val="0"/>
-          <w:color w:val="F2F2F2"/>
-          <w:sz w:val="19"/>
+          <w:color w:val="111111"/>
+          <w:sz w:val="20"/>
           <w:rtl/>
-          <w:szCs w:val="19"/>
+          <w:szCs w:val="20"/>
         </w:rPr>
         <w:t>המאגר הנושם ביותר. רעש קטן בקצוות, ורמה גבוהה ומוחזקת במרכז.</w:t>
       </w:r>
@@ -1677,30 +2280,18 @@
     <w:p>
       <w:pPr>
         <w:bidi/>
-        <w:spacing w:after="60"/>
+        <w:spacing w:after="120"/>
       </w:pPr>
       <w:r>
         <w:rPr>
           <w:rFonts w:ascii="David" w:hAnsi="David" w:cs="David"/>
           <w:b/>
           <w:i w:val="0"/>
-          <w:color w:val="F2F2F2"/>
-          <w:sz w:val="19"/>
+          <w:color w:val="111111"/>
+          <w:sz w:val="23"/>
           <w:rtl/>
           <w:bCs/>
-          <w:szCs w:val="19"/>
-        </w:rPr>
-        <w:t xml:space="preserve">הדימוי. </w:t>
-      </w:r>
-      <w:r>
-        <w:rPr>
-          <w:rFonts w:ascii="David" w:hAnsi="David" w:cs="David"/>
-          <w:b w:val="0"/>
-          <w:i w:val="0"/>
-          <w:color w:val="F2F2F2"/>
-          <w:sz w:val="19"/>
-          <w:rtl/>
-          <w:szCs w:val="19"/>
+          <w:szCs w:val="23"/>
         </w:rPr>
         <w:t>ביתן נמוך שגגו המגונן מתרומם לגבעה ירוקה במרכז ויורד חזרה אל הרחוב האפור.</w:t>
       </w:r>
@@ -1708,13 +2299,47 @@
     <w:p>
       <w:pPr>
         <w:bidi/>
-        <w:spacing w:after="160"/>
-      </w:pPr>
+        <w:spacing w:after="80"/>
+      </w:pPr>
+      <w:r>
+        <w:drawing>
+          <wp:inline xmlns:a="http://schemas.openxmlformats.org/drawingml/2006/main" xmlns:pic="http://schemas.openxmlformats.org/drawingml/2006/picture">
+            <wp:extent cx="6696000" cy="1664489"/>
+            <wp:docPr id="20" name="Picture 20"/>
+            <wp:cNvGraphicFramePr>
+              <a:graphicFrameLocks noChangeAspect="1"/>
+            </wp:cNvGraphicFramePr>
+            <a:graphic>
+              <a:graphicData uri="http://schemas.openxmlformats.org/drawingml/2006/picture">
+                <pic:pic>
+                  <pic:nvPicPr>
+                    <pic:cNvPr id="0" name="band-10.png"/>
+                    <pic:cNvPicPr/>
+                  </pic:nvPicPr>
+                  <pic:blipFill>
+                    <a:blip r:embed="rId38"/>
+                    <a:stretch>
+                      <a:fillRect/>
+                    </a:stretch>
+                  </pic:blipFill>
+                  <pic:spPr>
+                    <a:xfrm>
+                      <a:off x="0" y="0"/>
+                      <a:ext cx="6696000" cy="1664489"/>
+                    </a:xfrm>
+                    <a:prstGeom prst="rect"/>
+                  </pic:spPr>
+                </pic:pic>
+              </a:graphicData>
+            </a:graphic>
+          </wp:inline>
+        </w:drawing>
+      </w:r>
     </w:p>
     <w:p>
       <w:pPr>
         <w:sectPr>
-          <w:headerReference w:type="default" r:id="rId19"/>
+          <w:headerReference w:type="default" r:id="rId36"/>
           <w:pgSz w:w="11906" w:h="16838"/>
           <w:pgMar w:top="680" w:right="680" w:bottom="680" w:left="680" w:header="0" w:footer="720" w:gutter="0"/>
           <w:cols w:space="720"/>
@@ -1725,12 +2350,13 @@
     <w:p>
       <w:pPr>
         <w:bidi/>
+        <w:spacing w:after="80"/>
       </w:pPr>
       <w:r>
         <w:drawing>
           <wp:inline xmlns:a="http://schemas.openxmlformats.org/drawingml/2006/main" xmlns:pic="http://schemas.openxmlformats.org/drawingml/2006/picture">
-            <wp:extent cx="2808000" cy="2808000"/>
-            <wp:docPr id="8" name="Picture 8"/>
+            <wp:extent cx="4032000" cy="4032000"/>
+            <wp:docPr id="21" name="Picture 21"/>
             <wp:cNvGraphicFramePr>
               <a:graphicFrameLocks noChangeAspect="1"/>
             </wp:cNvGraphicFramePr>
@@ -1742,7 +2368,7 @@
                     <pic:cNvPicPr/>
                   </pic:nvPicPr>
                   <pic:blipFill>
-                    <a:blip r:embed="rId23"/>
+                    <a:blip r:embed="rId40"/>
                     <a:stretch>
                       <a:fillRect/>
                     </a:stretch>
@@ -1750,7 +2376,7 @@
                   <pic:spPr>
                     <a:xfrm>
                       <a:off x="0" y="0"/>
-                      <a:ext cx="2808000" cy="2808000"/>
+                      <a:ext cx="4032000" cy="4032000"/>
                     </a:xfrm>
                     <a:prstGeom prst="rect"/>
                   </pic:spPr>
@@ -1764,14 +2390,14 @@
     <w:p>
       <w:pPr>
         <w:bidi/>
-        <w:spacing w:after="80"/>
+        <w:spacing w:after="120"/>
       </w:pPr>
       <w:r>
         <w:rPr>
           <w:rFonts w:ascii="Arial" w:hAnsi="Arial" w:cs="Arial"/>
           <w:b w:val="0"/>
           <w:i w:val="0"/>
-          <w:color w:val="A3A3A3"/>
+          <w:color w:val="707070"/>
           <w:sz w:val="14"/>
           <w:rtl/>
           <w:szCs w:val="14"/>
@@ -1786,29 +2412,47 @@
       </w:pPr>
       <w:r>
         <w:rPr>
+          <w:rFonts w:ascii="Arial" w:hAnsi="Arial" w:cs="Arial"/>
+          <w:b w:val="0"/>
+          <w:i w:val="0"/>
+          <w:color w:val="111111"/>
+          <w:sz w:val="52"/>
+          <w:rtl/>
+          <w:szCs w:val="52"/>
+        </w:rPr>
+        <w:t>07</w:t>
+      </w:r>
+    </w:p>
+    <w:p>
+      <w:pPr>
+        <w:bidi/>
+        <w:spacing w:after="0"/>
+      </w:pPr>
+      <w:r>
+        <w:rPr>
           <w:rFonts w:ascii="David" w:hAnsi="David" w:cs="David"/>
           <w:b/>
           <w:i w:val="0"/>
-          <w:color w:val="F2F2F2"/>
+          <w:color w:val="111111"/>
           <w:sz w:val="30"/>
           <w:rtl/>
           <w:bCs/>
           <w:szCs w:val="30"/>
         </w:rPr>
-        <w:t>07  שתי נשימות</w:t>
+        <w:t>שתי נשימות</w:t>
       </w:r>
     </w:p>
     <w:p>
       <w:pPr>
         <w:bidi/>
-        <w:spacing w:after="80"/>
+        <w:spacing w:after="120"/>
       </w:pPr>
       <w:r>
         <w:rPr>
           <w:rFonts w:ascii="Arial" w:hAnsi="Arial" w:cs="Arial"/>
           <w:b w:val="0"/>
           <w:i w:val="0"/>
-          <w:color w:val="A3A3A3"/>
+          <w:color w:val="707070"/>
           <w:sz w:val="14"/>
           <w:rtl/>
           <w:szCs w:val="14"/>
@@ -1819,18 +2463,18 @@
     <w:p>
       <w:pPr>
         <w:bidi/>
-        <w:spacing w:after="60"/>
+        <w:spacing w:after="80"/>
       </w:pPr>
       <w:r>
         <w:rPr>
           <w:rFonts w:ascii="David" w:hAnsi="David" w:cs="David"/>
           <w:b/>
           <w:i w:val="0"/>
-          <w:color w:val="F2F2F2"/>
-          <w:sz w:val="19"/>
+          <w:color w:val="111111"/>
+          <w:sz w:val="20"/>
           <w:rtl/>
           <w:bCs/>
-          <w:szCs w:val="19"/>
+          <w:szCs w:val="20"/>
         </w:rPr>
         <w:t xml:space="preserve">הנתונים. </w:t>
       </w:r>
@@ -1839,10 +2483,10 @@
           <w:rFonts w:ascii="David" w:hAnsi="David" w:cs="David"/>
           <w:b w:val="0"/>
           <w:i w:val="0"/>
-          <w:color w:val="F2F2F2"/>
-          <w:sz w:val="19"/>
+          <w:color w:val="111111"/>
+          <w:sz w:val="20"/>
           <w:rtl/>
-          <w:szCs w:val="19"/>
+          <w:szCs w:val="20"/>
         </w:rPr>
         <w:t>ריכוז חלקיקים לפי שעה. אותה צורה של יום התנועה, אבל האוויר מתנקה לאט מכפי שהוא מזדהם.</w:t>
       </w:r>
@@ -1850,18 +2494,18 @@
     <w:p>
       <w:pPr>
         <w:bidi/>
-        <w:spacing w:after="60"/>
+        <w:spacing w:after="80"/>
       </w:pPr>
       <w:r>
         <w:rPr>
           <w:rFonts w:ascii="David" w:hAnsi="David" w:cs="David"/>
           <w:b/>
           <w:i w:val="0"/>
-          <w:color w:val="F2F2F2"/>
-          <w:sz w:val="19"/>
+          <w:color w:val="111111"/>
+          <w:sz w:val="20"/>
           <w:rtl/>
           <w:bCs/>
-          <w:szCs w:val="19"/>
+          <w:szCs w:val="20"/>
         </w:rPr>
         <w:t xml:space="preserve">הצליל. </w:t>
       </w:r>
@@ -1870,10 +2514,10 @@
           <w:rFonts w:ascii="David" w:hAnsi="David" w:cs="David"/>
           <w:b w:val="0"/>
           <w:i w:val="0"/>
-          <w:color w:val="F2F2F2"/>
-          <w:sz w:val="19"/>
+          <w:color w:val="111111"/>
+          <w:sz w:val="20"/>
           <w:rtl/>
-          <w:szCs w:val="19"/>
+          <w:szCs w:val="20"/>
         </w:rPr>
         <w:t>שני שיאים, והירידה איטית מהעלייה. הצ'לו מחזיק את המתח גם אחרי שהשיא עבר.</w:t>
       </w:r>
@@ -1881,30 +2525,18 @@
     <w:p>
       <w:pPr>
         <w:bidi/>
-        <w:spacing w:after="60"/>
+        <w:spacing w:after="120"/>
       </w:pPr>
       <w:r>
         <w:rPr>
           <w:rFonts w:ascii="David" w:hAnsi="David" w:cs="David"/>
           <w:b/>
           <w:i w:val="0"/>
-          <w:color w:val="F2F2F2"/>
-          <w:sz w:val="19"/>
+          <w:color w:val="111111"/>
+          <w:sz w:val="23"/>
           <w:rtl/>
           <w:bCs/>
-          <w:szCs w:val="19"/>
-        </w:rPr>
-        <w:t xml:space="preserve">הדימוי. </w:t>
-      </w:r>
-      <w:r>
-        <w:rPr>
-          <w:rFonts w:ascii="David" w:hAnsi="David" w:cs="David"/>
-          <w:b w:val="0"/>
-          <w:i w:val="0"/>
-          <w:color w:val="F2F2F2"/>
-          <w:sz w:val="19"/>
-          <w:rtl/>
-          <w:szCs w:val="19"/>
+          <w:szCs w:val="23"/>
         </w:rPr>
         <w:t>שתי כיפות ממברנה שקופות מעל כיכר, אובך בפסגות ובהירות בבסיס.</w:t>
       </w:r>
@@ -1912,18 +2544,64 @@
     <w:p>
       <w:pPr>
         <w:bidi/>
-        <w:spacing w:after="160"/>
-      </w:pPr>
-    </w:p>
-    <w:p>
-      <w:pPr>
-        <w:bidi/>
+        <w:spacing w:after="80"/>
       </w:pPr>
       <w:r>
         <w:drawing>
           <wp:inline xmlns:a="http://schemas.openxmlformats.org/drawingml/2006/main" xmlns:pic="http://schemas.openxmlformats.org/drawingml/2006/picture">
-            <wp:extent cx="2808000" cy="2808000"/>
-            <wp:docPr id="9" name="Picture 9"/>
+            <wp:extent cx="6696000" cy="1664489"/>
+            <wp:docPr id="22" name="Picture 22"/>
+            <wp:cNvGraphicFramePr>
+              <a:graphicFrameLocks noChangeAspect="1"/>
+            </wp:cNvGraphicFramePr>
+            <a:graphic>
+              <a:graphicData uri="http://schemas.openxmlformats.org/drawingml/2006/picture">
+                <pic:pic>
+                  <pic:nvPicPr>
+                    <pic:cNvPr id="0" name="band-11.png"/>
+                    <pic:cNvPicPr/>
+                  </pic:nvPicPr>
+                  <pic:blipFill>
+                    <a:blip r:embed="rId41"/>
+                    <a:stretch>
+                      <a:fillRect/>
+                    </a:stretch>
+                  </pic:blipFill>
+                  <pic:spPr>
+                    <a:xfrm>
+                      <a:off x="0" y="0"/>
+                      <a:ext cx="6696000" cy="1664489"/>
+                    </a:xfrm>
+                    <a:prstGeom prst="rect"/>
+                  </pic:spPr>
+                </pic:pic>
+              </a:graphicData>
+            </a:graphic>
+          </wp:inline>
+        </w:drawing>
+      </w:r>
+    </w:p>
+    <w:p>
+      <w:pPr>
+        <w:sectPr>
+          <w:headerReference w:type="default" r:id="rId39"/>
+          <w:pgSz w:w="11906" w:h="16838"/>
+          <w:pgMar w:top="680" w:right="680" w:bottom="680" w:left="680" w:header="0" w:footer="720" w:gutter="0"/>
+          <w:cols w:space="720"/>
+          <w:docGrid w:linePitch="360"/>
+        </w:sectPr>
+      </w:pPr>
+    </w:p>
+    <w:p>
+      <w:pPr>
+        <w:bidi/>
+        <w:spacing w:after="80"/>
+      </w:pPr>
+      <w:r>
+        <w:drawing>
+          <wp:inline xmlns:a="http://schemas.openxmlformats.org/drawingml/2006/main" xmlns:pic="http://schemas.openxmlformats.org/drawingml/2006/picture">
+            <wp:extent cx="4032000" cy="4032000"/>
+            <wp:docPr id="23" name="Picture 23"/>
             <wp:cNvGraphicFramePr>
               <a:graphicFrameLocks noChangeAspect="1"/>
             </wp:cNvGraphicFramePr>
@@ -1935,7 +2613,7 @@
                     <pic:cNvPicPr/>
                   </pic:nvPicPr>
                   <pic:blipFill>
-                    <a:blip r:embed="rId24"/>
+                    <a:blip r:embed="rId43"/>
                     <a:stretch>
                       <a:fillRect/>
                     </a:stretch>
@@ -1943,7 +2621,7 @@
                   <pic:spPr>
                     <a:xfrm>
                       <a:off x="0" y="0"/>
-                      <a:ext cx="2808000" cy="2808000"/>
+                      <a:ext cx="4032000" cy="4032000"/>
                     </a:xfrm>
                     <a:prstGeom prst="rect"/>
                   </pic:spPr>
@@ -1957,14 +2635,14 @@
     <w:p>
       <w:pPr>
         <w:bidi/>
-        <w:spacing w:after="80"/>
+        <w:spacing w:after="120"/>
       </w:pPr>
       <w:r>
         <w:rPr>
           <w:rFonts w:ascii="Arial" w:hAnsi="Arial" w:cs="Arial"/>
           <w:b w:val="0"/>
           <w:i w:val="0"/>
-          <w:color w:val="A3A3A3"/>
+          <w:color w:val="707070"/>
           <w:sz w:val="14"/>
           <w:rtl/>
           <w:szCs w:val="14"/>
@@ -1979,29 +2657,47 @@
       </w:pPr>
       <w:r>
         <w:rPr>
+          <w:rFonts w:ascii="Arial" w:hAnsi="Arial" w:cs="Arial"/>
+          <w:b w:val="0"/>
+          <w:i w:val="0"/>
+          <w:color w:val="111111"/>
+          <w:sz w:val="52"/>
+          <w:rtl/>
+          <w:szCs w:val="52"/>
+        </w:rPr>
+        <w:t>08</w:t>
+      </w:r>
+    </w:p>
+    <w:p>
+      <w:pPr>
+        <w:bidi/>
+        <w:spacing w:after="0"/>
+      </w:pPr>
+      <w:r>
+        <w:rPr>
           <w:rFonts w:ascii="David" w:hAnsi="David" w:cs="David"/>
           <w:b/>
           <w:i w:val="0"/>
-          <w:color w:val="F2F2F2"/>
+          <w:color w:val="111111"/>
           <w:sz w:val="30"/>
           <w:rtl/>
           <w:bCs/>
           <w:szCs w:val="30"/>
         </w:rPr>
-        <w:t>08  החריץ</w:t>
+        <w:t>החריץ</w:t>
       </w:r>
     </w:p>
     <w:p>
       <w:pPr>
         <w:bidi/>
-        <w:spacing w:after="80"/>
+        <w:spacing w:after="120"/>
       </w:pPr>
       <w:r>
         <w:rPr>
           <w:rFonts w:ascii="Arial" w:hAnsi="Arial" w:cs="Arial"/>
           <w:b w:val="0"/>
           <w:i w:val="0"/>
-          <w:color w:val="A3A3A3"/>
+          <w:color w:val="707070"/>
           <w:sz w:val="14"/>
           <w:rtl/>
           <w:szCs w:val="14"/>
@@ -2012,18 +2708,18 @@
     <w:p>
       <w:pPr>
         <w:bidi/>
-        <w:spacing w:after="60"/>
+        <w:spacing w:after="80"/>
       </w:pPr>
       <w:r>
         <w:rPr>
           <w:rFonts w:ascii="David" w:hAnsi="David" w:cs="David"/>
           <w:b/>
           <w:i w:val="0"/>
-          <w:color w:val="F2F2F2"/>
-          <w:sz w:val="19"/>
+          <w:color w:val="111111"/>
+          <w:sz w:val="20"/>
           <w:rtl/>
           <w:bCs/>
-          <w:szCs w:val="19"/>
+          <w:szCs w:val="20"/>
         </w:rPr>
         <w:t xml:space="preserve">הנתונים. </w:t>
       </w:r>
@@ -2032,10 +2728,10 @@
           <w:rFonts w:ascii="David" w:hAnsi="David" w:cs="David"/>
           <w:b w:val="0"/>
           <w:i w:val="0"/>
-          <w:color w:val="F2F2F2"/>
-          <w:sz w:val="19"/>
+          <w:color w:val="111111"/>
+          <w:sz w:val="20"/>
           <w:rtl/>
-          <w:szCs w:val="19"/>
+          <w:szCs w:val="20"/>
         </w:rPr>
         <w:t>גובה הקרקע לרוחב נחל לכיש, מגדה לגדה. שני מישורים ועמק צר ביניהם.</w:t>
       </w:r>
@@ -2043,18 +2739,18 @@
     <w:p>
       <w:pPr>
         <w:bidi/>
-        <w:spacing w:after="60"/>
+        <w:spacing w:after="80"/>
       </w:pPr>
       <w:r>
         <w:rPr>
           <w:rFonts w:ascii="David" w:hAnsi="David" w:cs="David"/>
           <w:b/>
           <w:i w:val="0"/>
-          <w:color w:val="F2F2F2"/>
-          <w:sz w:val="19"/>
+          <w:color w:val="111111"/>
+          <w:sz w:val="20"/>
           <w:rtl/>
           <w:bCs/>
-          <w:szCs w:val="19"/>
+          <w:szCs w:val="20"/>
         </w:rPr>
         <w:t xml:space="preserve">הצליל. </w:t>
       </w:r>
@@ -2063,10 +2759,10 @@
           <w:rFonts w:ascii="David" w:hAnsi="David" w:cs="David"/>
           <w:b w:val="0"/>
           <w:i w:val="0"/>
-          <w:color w:val="F2F2F2"/>
-          <w:sz w:val="19"/>
+          <w:color w:val="111111"/>
+          <w:sz w:val="20"/>
           <w:rtl/>
-          <w:szCs w:val="19"/>
+          <w:szCs w:val="20"/>
         </w:rPr>
         <w:t>ההפך מכל השאר: השיא הוא למטה. עם נבל, הצלילה נשמעת כמו מפל.</w:t>
       </w:r>
@@ -2074,67 +2770,256 @@
     <w:p>
       <w:pPr>
         <w:bidi/>
-        <w:spacing w:after="60"/>
+        <w:spacing w:after="120"/>
       </w:pPr>
       <w:r>
         <w:rPr>
           <w:rFonts w:ascii="David" w:hAnsi="David" w:cs="David"/>
           <w:b/>
           <w:i w:val="0"/>
-          <w:color w:val="F2F2F2"/>
-          <w:sz w:val="19"/>
+          <w:color w:val="111111"/>
+          <w:sz w:val="23"/>
           <w:rtl/>
           <w:bCs/>
-          <w:szCs w:val="19"/>
+          <w:szCs w:val="23"/>
         </w:rPr>
-        <w:t xml:space="preserve">הדימוי. </w:t>
+        <w:t>שני מישורי אבן וחריץ צר ועמוק ביניהם, ובתחתיתו ערוץ מים.</w:t>
       </w:r>
+    </w:p>
+    <w:p>
+      <w:pPr>
+        <w:bidi/>
+        <w:spacing w:after="80"/>
+      </w:pPr>
+      <w:r>
+        <w:drawing>
+          <wp:inline xmlns:a="http://schemas.openxmlformats.org/drawingml/2006/main" xmlns:pic="http://schemas.openxmlformats.org/drawingml/2006/picture">
+            <wp:extent cx="6696000" cy="1664489"/>
+            <wp:docPr id="24" name="Picture 24"/>
+            <wp:cNvGraphicFramePr>
+              <a:graphicFrameLocks noChangeAspect="1"/>
+            </wp:cNvGraphicFramePr>
+            <a:graphic>
+              <a:graphicData uri="http://schemas.openxmlformats.org/drawingml/2006/picture">
+                <pic:pic>
+                  <pic:nvPicPr>
+                    <pic:cNvPr id="0" name="band-12.png"/>
+                    <pic:cNvPicPr/>
+                  </pic:nvPicPr>
+                  <pic:blipFill>
+                    <a:blip r:embed="rId44"/>
+                    <a:stretch>
+                      <a:fillRect/>
+                    </a:stretch>
+                  </pic:blipFill>
+                  <pic:spPr>
+                    <a:xfrm>
+                      <a:off x="0" y="0"/>
+                      <a:ext cx="6696000" cy="1664489"/>
+                    </a:xfrm>
+                    <a:prstGeom prst="rect"/>
+                  </pic:spPr>
+                </pic:pic>
+              </a:graphicData>
+            </a:graphic>
+          </wp:inline>
+        </w:drawing>
+      </w:r>
+    </w:p>
+    <w:p>
+      <w:pPr>
+        <w:sectPr>
+          <w:headerReference w:type="default" r:id="rId42"/>
+          <w:pgSz w:w="11906" w:h="16838"/>
+          <w:pgMar w:top="680" w:right="680" w:bottom="680" w:left="680" w:header="0" w:footer="720" w:gutter="0"/>
+          <w:cols w:space="720"/>
+          <w:docGrid w:linePitch="360"/>
+        </w:sectPr>
+      </w:pPr>
+    </w:p>
+    <w:p>
+      <w:pPr>
+        <w:bidi/>
+        <w:spacing w:after="80"/>
+      </w:pPr>
+      <w:r>
+        <w:drawing>
+          <wp:inline xmlns:a="http://schemas.openxmlformats.org/drawingml/2006/main" xmlns:pic="http://schemas.openxmlformats.org/drawingml/2006/picture">
+            <wp:extent cx="4032000" cy="4032000"/>
+            <wp:docPr id="25" name="Picture 25"/>
+            <wp:cNvGraphicFramePr>
+              <a:graphicFrameLocks noChangeAspect="1"/>
+            </wp:cNvGraphicFramePr>
+            <a:graphic>
+              <a:graphicData uri="http://schemas.openxmlformats.org/drawingml/2006/picture">
+                <pic:pic>
+                  <pic:nvPicPr>
+                    <pic:cNvPr id="0" name="grid.jpg"/>
+                    <pic:cNvPicPr/>
+                  </pic:nvPicPr>
+                  <pic:blipFill>
+                    <a:blip r:embed="rId46"/>
+                    <a:stretch>
+                      <a:fillRect/>
+                    </a:stretch>
+                  </pic:blipFill>
+                  <pic:spPr>
+                    <a:xfrm>
+                      <a:off x="0" y="0"/>
+                      <a:ext cx="4032000" cy="4032000"/>
+                    </a:xfrm>
+                    <a:prstGeom prst="rect"/>
+                  </pic:spPr>
+                </pic:pic>
+              </a:graphicData>
+            </a:graphic>
+          </wp:inline>
+        </w:drawing>
+      </w:r>
+    </w:p>
+    <w:p>
+      <w:pPr>
+        <w:bidi/>
+        <w:spacing w:after="120"/>
+      </w:pPr>
+      <w:r>
+        <w:rPr>
+          <w:rFonts w:ascii="Arial" w:hAnsi="Arial" w:cs="Arial"/>
+          <w:b w:val="0"/>
+          <w:i w:val="0"/>
+          <w:color w:val="707070"/>
+          <w:sz w:val="14"/>
+          <w:rtl/>
+          <w:szCs w:val="14"/>
+        </w:rPr>
+        <w:t>הדמיה</w:t>
+      </w:r>
+    </w:p>
+    <w:p>
+      <w:pPr>
+        <w:bidi/>
+        <w:spacing w:after="0"/>
+      </w:pPr>
+      <w:r>
+        <w:rPr>
+          <w:rFonts w:ascii="Arial" w:hAnsi="Arial" w:cs="Arial"/>
+          <w:b w:val="0"/>
+          <w:i w:val="0"/>
+          <w:color w:val="111111"/>
+          <w:sz w:val="52"/>
+          <w:rtl/>
+          <w:szCs w:val="52"/>
+        </w:rPr>
+        <w:t>4</w:t>
+      </w:r>
+    </w:p>
+    <w:p>
+      <w:pPr>
+        <w:bidi/>
+        <w:spacing w:after="0"/>
+      </w:pPr>
+      <w:r>
+        <w:rPr>
+          <w:rFonts w:ascii="David" w:hAnsi="David" w:cs="David"/>
+          <w:b/>
+          <w:i w:val="0"/>
+          <w:color w:val="111111"/>
+          <w:sz w:val="30"/>
+          <w:rtl/>
+          <w:bCs/>
+          <w:szCs w:val="30"/>
+        </w:rPr>
+        <w:t>מה זה אומר לתכנון</w:t>
+      </w:r>
+    </w:p>
+    <w:p>
+      <w:pPr>
+        <w:bidi/>
+        <w:spacing w:after="120"/>
+      </w:pPr>
+      <w:r>
+        <w:rPr>
+          <w:rFonts w:ascii="Arial" w:hAnsi="Arial" w:cs="Arial"/>
+          <w:b w:val="0"/>
+          <w:i w:val="0"/>
+          <w:color w:val="707070"/>
+          <w:sz w:val="14"/>
+          <w:rtl/>
+          <w:szCs w:val="14"/>
+        </w:rPr>
+        <w:t>DATASONG</w:t>
+      </w:r>
+    </w:p>
+    <w:p>
+      <w:pPr>
+        <w:bidi/>
+        <w:spacing w:after="80"/>
+      </w:pPr>
       <w:r>
         <w:rPr>
           <w:rFonts w:ascii="David" w:hAnsi="David" w:cs="David"/>
           <w:b w:val="0"/>
           <w:i w:val="0"/>
-          <w:color w:val="F2F2F2"/>
-          <w:sz w:val="19"/>
+          <w:color w:val="111111"/>
+          <w:sz w:val="20"/>
           <w:rtl/>
-          <w:szCs w:val="19"/>
+          <w:szCs w:val="20"/>
         </w:rPr>
-        <w:t>שני מישורי אבן וחריץ צר ועמוק ביניהם, ובתחתיתו ערוץ מים.</w:t>
+        <w:t>בשיתוף ציבור, טבלה נקראת ונשכחת. צליל נזכר. כשקהל שומע את יום התנועה לפני שהוא רואה גרף, הוא מזהה את שעות העומס לבד, ומתאר את המקום במילים שלו. ההדמיה מגיעה אחר כך, כפרשנות אחת מני רבות, ולא כתשובה.</w:t>
       </w:r>
     </w:p>
     <w:p>
       <w:pPr>
         <w:bidi/>
-        <w:spacing w:after="160"/>
-      </w:pPr>
+        <w:spacing w:after="80"/>
+      </w:pPr>
+      <w:r>
+        <w:rPr>
+          <w:rFonts w:ascii="David" w:hAnsi="David" w:cs="David"/>
+          <w:b w:val="0"/>
+          <w:i w:val="0"/>
+          <w:color w:val="111111"/>
+          <w:sz w:val="20"/>
+          <w:rtl/>
+          <w:szCs w:val="20"/>
+        </w:rPr>
+        <w:t>1. בחרו סדרה אחת שמספרת סיפור מרחבי: חתך, יום, או ציר רחוב.</w:t>
+      </w:r>
     </w:p>
     <w:p>
       <w:pPr>
-        <w:sectPr>
-          <w:headerReference w:type="default" r:id="rId22"/>
-          <w:pgSz w:w="11906" w:h="16838"/>
-          <w:pgMar w:top="680" w:right="680" w:bottom="680" w:left="680" w:header="0" w:footer="720" w:gutter="0"/>
-          <w:cols w:space="720"/>
-          <w:docGrid w:linePitch="360"/>
-        </w:sectPr>
-      </w:pPr>
+        <w:bidi/>
+        <w:spacing w:after="80"/>
+      </w:pPr>
+      <w:r>
+        <w:rPr>
+          <w:rFonts w:ascii="David" w:hAnsi="David" w:cs="David"/>
+          <w:b w:val="0"/>
+          <w:i w:val="0"/>
+          <w:color w:val="111111"/>
+          <w:sz w:val="20"/>
+          <w:rtl/>
+          <w:szCs w:val="20"/>
+        </w:rPr>
+        <w:t>2. השמיעו אותה לפני שאתם מציגים גרף, ובקשו לזהות את השיא.</w:t>
+      </w:r>
     </w:p>
     <w:p>
       <w:pPr>
         <w:bidi/>
-        <w:spacing w:after="0"/>
+        <w:spacing w:after="80"/>
       </w:pPr>
       <w:r>
         <w:rPr>
-          <w:rFonts w:ascii="Arial" w:hAnsi="Arial" w:cs="Arial"/>
+          <w:rFonts w:ascii="David" w:hAnsi="David" w:cs="David"/>
           <w:b w:val="0"/>
           <w:i w:val="0"/>
-          <w:color w:val="F2F2F2"/>
-          <w:sz w:val="60"/>
+          <w:color w:val="111111"/>
+          <w:sz w:val="20"/>
           <w:rtl/>
-          <w:szCs w:val="60"/>
+          <w:szCs w:val="20"/>
         </w:rPr>
-        <w:t>4</w:t>
+        <w:t>3. בקשו לתאר את המקום שנשמע, ורק אז הציגו את השרטוט וההדמיה.</w:t>
       </w:r>
     </w:p>
     <w:p>
@@ -2147,101 +3032,11 @@
           <w:rFonts w:ascii="David" w:hAnsi="David" w:cs="David"/>
           <w:b/>
           <w:i w:val="0"/>
-          <w:color w:val="F2F2F2"/>
-          <w:sz w:val="32"/>
+          <w:color w:val="111111"/>
+          <w:sz w:val="23"/>
           <w:rtl/>
           <w:bCs/>
-          <w:szCs w:val="32"/>
-        </w:rPr>
-        <w:t>מה זה אומר לתכנון</w:t>
-      </w:r>
-    </w:p>
-    <w:p>
-      <w:pPr>
-        <w:bidi/>
-        <w:spacing w:after="120"/>
-      </w:pPr>
-      <w:r>
-        <w:rPr>
-          <w:rFonts w:ascii="David" w:hAnsi="David" w:cs="David"/>
-          <w:b w:val="0"/>
-          <w:i w:val="0"/>
-          <w:color w:val="F2F2F2"/>
-          <w:sz w:val="21"/>
-          <w:rtl/>
-          <w:szCs w:val="21"/>
-        </w:rPr>
-        <w:t>בשיתוף ציבור, טבלה נקראת ונשכחת. צליל נזכר. כשקהל שומע את יום התנועה לפני שהוא רואה גרף, הוא מזהה את שעות העומס לבד, ומתאר את המקום במילים שלו. ההדמיה מגיעה אחר כך, כפרשנות אחת מני רבות, ולא כתשובה.</w:t>
-      </w:r>
-    </w:p>
-    <w:p>
-      <w:pPr>
-        <w:bidi/>
-        <w:spacing w:after="60"/>
-      </w:pPr>
-      <w:r>
-        <w:rPr>
-          <w:rFonts w:ascii="David" w:hAnsi="David" w:cs="David"/>
-          <w:b w:val="0"/>
-          <w:i w:val="0"/>
-          <w:color w:val="F2F2F2"/>
-          <w:sz w:val="21"/>
-          <w:rtl/>
-          <w:szCs w:val="21"/>
-        </w:rPr>
-        <w:t>1. בחרו סדרה אחת שמספרת סיפור מרחבי: חתך, יום, או ציר רחוב.</w:t>
-      </w:r>
-    </w:p>
-    <w:p>
-      <w:pPr>
-        <w:bidi/>
-        <w:spacing w:after="60"/>
-      </w:pPr>
-      <w:r>
-        <w:rPr>
-          <w:rFonts w:ascii="David" w:hAnsi="David" w:cs="David"/>
-          <w:b w:val="0"/>
-          <w:i w:val="0"/>
-          <w:color w:val="F2F2F2"/>
-          <w:sz w:val="21"/>
-          <w:rtl/>
-          <w:szCs w:val="21"/>
-        </w:rPr>
-        <w:t>2. השמיעו אותה לפני שאתם מציגים גרף, ובקשו לזהות את השיא.</w:t>
-      </w:r>
-    </w:p>
-    <w:p>
-      <w:pPr>
-        <w:bidi/>
-        <w:spacing w:after="60"/>
-      </w:pPr>
-      <w:r>
-        <w:rPr>
-          <w:rFonts w:ascii="David" w:hAnsi="David" w:cs="David"/>
-          <w:b w:val="0"/>
-          <w:i w:val="0"/>
-          <w:color w:val="F2F2F2"/>
-          <w:sz w:val="21"/>
-          <w:rtl/>
-          <w:szCs w:val="21"/>
-        </w:rPr>
-        <w:t>3. בקשו לתאר את המקום שנשמע, ורק אז הציגו את השרטוט וההדמיה.</w:t>
-      </w:r>
-    </w:p>
-    <w:p>
-      <w:pPr>
-        <w:bidi/>
-        <w:spacing w:after="240"/>
-      </w:pPr>
-      <w:r>
-        <w:rPr>
-          <w:rFonts w:ascii="David" w:hAnsi="David" w:cs="David"/>
-          <w:b w:val="0"/>
-          <w:i w:val="0"/>
-          <w:color w:val="F2F2F2"/>
-          <w:sz w:val="36"/>
-          <w:rtl/>
-          <w:szCs w:val="36"/>
+          <w:szCs w:val="23"/>
         </w:rPr>
         <w:t>איזה נתון בעיר שלכם הייתם רוצים לשמוע לפני שאתם רואים אותו?</w:t>
       </w:r>
@@ -2249,150 +3044,45 @@
     <w:p>
       <w:pPr>
         <w:bidi/>
-        <w:spacing w:after="160"/>
+        <w:spacing w:after="80"/>
       </w:pPr>
       <w:r>
-        <w:rPr>
-          <w:rFonts w:ascii="David" w:hAnsi="David" w:cs="David"/>
-          <w:b w:val="0"/>
-          <w:i w:val="0"/>
-          <w:color w:val="A3A3A3"/>
-          <w:sz w:val="17"/>
-          <w:rtl/>
-          <w:szCs w:val="17"/>
-        </w:rPr>
-        <w:t>הערת הדמיה: כל הדימויים במאמר נוצרו בבינה מלאכותית לפי פרומפטים שנכתבו לכל סדרה, ואינם מבנים קיימים. הנתונים הם פרופילים מייצגים: נכונים בצורתם ובהתנהגותם, ולא נשלפו ממדידה חיה.</w:t>
-      </w:r>
-    </w:p>
-    <w:p>
-      <w:pPr>
-        <w:bidi/>
-        <w:spacing w:after="60"/>
-      </w:pPr>
-      <w:r>
-        <w:rPr>
-          <w:rFonts w:ascii="Arial" w:hAnsi="Arial" w:cs="Arial"/>
-          <w:b/>
-          <w:i w:val="0"/>
-          <w:color w:val="F2F2F2"/>
-          <w:sz w:val="18"/>
-          <w:rtl/>
-          <w:bCs/>
-          <w:szCs w:val="18"/>
-        </w:rPr>
-        <w:t>מקורות</w:t>
-      </w:r>
-    </w:p>
-    <w:p>
-      <w:pPr>
-        <w:bidi/>
-        <w:spacing w:after="40"/>
-      </w:pPr>
-      <w:r>
-        <w:rPr>
-          <w:rFonts w:ascii="David" w:hAnsi="David" w:cs="David"/>
-          <w:b w:val="0"/>
-          <w:i w:val="0"/>
-          <w:color w:val="A3A3A3"/>
-          <w:sz w:val="17"/>
-          <w:rtl/>
-          <w:szCs w:val="17"/>
-        </w:rPr>
-        <w:t>Johann Peter Eckermann, Gespräche mit Goethe, שיחה מ־23 במרץ 1829.</w:t>
-      </w:r>
-    </w:p>
-    <w:p>
-      <w:pPr>
-        <w:bidi/>
-        <w:spacing w:after="40"/>
-      </w:pPr>
-      <w:r>
-        <w:rPr>
-          <w:rFonts w:ascii="David" w:hAnsi="David" w:cs="David"/>
-          <w:b w:val="0"/>
-          <w:i w:val="0"/>
-          <w:color w:val="A3A3A3"/>
-          <w:sz w:val="17"/>
-          <w:rtl/>
-          <w:szCs w:val="17"/>
-        </w:rPr>
-        <w:t>F. W. J. Schelling, Philosophie der Kunst, הרצאות 1802–1803.</w:t>
-      </w:r>
-    </w:p>
-    <w:p>
-      <w:pPr>
-        <w:bidi/>
-        <w:spacing w:after="40"/>
-      </w:pPr>
-      <w:r>
-        <w:rPr>
-          <w:rFonts w:ascii="David" w:hAnsi="David" w:cs="David"/>
-          <w:b w:val="0"/>
-          <w:i w:val="0"/>
-          <w:color w:val="A3A3A3"/>
-          <w:sz w:val="17"/>
-          <w:rtl/>
-          <w:szCs w:val="17"/>
-        </w:rPr>
-        <w:t>Iannis Xenakis, Formalized Music, Indiana University Press, 1971.</w:t>
-      </w:r>
-    </w:p>
-    <w:p>
-      <w:pPr>
-        <w:bidi/>
-        <w:spacing w:after="40"/>
-      </w:pPr>
-      <w:r>
-        <w:rPr>
-          <w:rFonts w:ascii="David" w:hAnsi="David" w:cs="David"/>
-          <w:b w:val="0"/>
-          <w:i w:val="0"/>
-          <w:color w:val="A3A3A3"/>
-          <w:sz w:val="17"/>
-          <w:rtl/>
-          <w:szCs w:val="17"/>
-        </w:rPr>
-        <w:t>Philips Pavilion, Expo 58, Brussels. Le Corbusier ו־Iannis Xenakis.</w:t>
-      </w:r>
-    </w:p>
-    <w:p>
-      <w:pPr>
-        <w:bidi/>
-        <w:spacing w:after="40"/>
-      </w:pPr>
-      <w:r>
-        <w:rPr>
-          <w:rFonts w:ascii="David" w:hAnsi="David" w:cs="David"/>
-          <w:b w:val="0"/>
-          <w:i w:val="0"/>
-          <w:color w:val="A3A3A3"/>
-          <w:sz w:val="17"/>
-          <w:rtl/>
-          <w:szCs w:val="17"/>
-        </w:rPr>
-        <w:t>DataSong, אפליקציה פתוחה: הנתונים, הקוד והפרומפטים.</w:t>
-      </w:r>
-    </w:p>
-    <w:p>
-      <w:pPr>
-        <w:bidi/>
-        <w:spacing w:after="0"/>
-      </w:pPr>
-      <w:r>
-        <w:rPr>
-          <w:rFonts w:ascii="David" w:hAnsi="David" w:cs="David"/>
-          <w:b w:val="0"/>
-          <w:i w:val="0"/>
-          <w:color w:val="A3A3A3"/>
-          <w:sz w:val="17"/>
-          <w:rtl/>
-          <w:szCs w:val="17"/>
-        </w:rPr>
-        <w:t>הדפים יורדים מבהיר לכהה, כמו מעבר מקיר גלריה לחדר האזנה, עם קפיצה אחת באמצע. רוחב כל תמונה הוא חתך הזהב של רוחב הדף, וגובה תמונת השער הוא חתך הזהב של גובהו.</w:t>
+        <w:drawing>
+          <wp:inline xmlns:a="http://schemas.openxmlformats.org/drawingml/2006/main" xmlns:pic="http://schemas.openxmlformats.org/drawingml/2006/picture">
+            <wp:extent cx="6696000" cy="1664489"/>
+            <wp:docPr id="26" name="Picture 26"/>
+            <wp:cNvGraphicFramePr>
+              <a:graphicFrameLocks noChangeAspect="1"/>
+            </wp:cNvGraphicFramePr>
+            <a:graphic>
+              <a:graphicData uri="http://schemas.openxmlformats.org/drawingml/2006/picture">
+                <pic:pic>
+                  <pic:nvPicPr>
+                    <pic:cNvPr id="0" name="band-13.png"/>
+                    <pic:cNvPicPr/>
+                  </pic:nvPicPr>
+                  <pic:blipFill>
+                    <a:blip r:embed="rId47"/>
+                    <a:stretch>
+                      <a:fillRect/>
+                    </a:stretch>
+                  </pic:blipFill>
+                  <pic:spPr>
+                    <a:xfrm>
+                      <a:off x="0" y="0"/>
+                      <a:ext cx="6696000" cy="1664489"/>
+                    </a:xfrm>
+                    <a:prstGeom prst="rect"/>
+                  </pic:spPr>
+                </pic:pic>
+              </a:graphicData>
+            </a:graphic>
+          </wp:inline>
+        </w:drawing>
       </w:r>
     </w:p>
     <w:sectPr>
-      <w:headerReference w:type="default" r:id="rId25"/>
+      <w:headerReference w:type="default" r:id="rId45"/>
       <w:pgSz w:w="11906" w:h="16838"/>
       <w:pgMar w:top="680" w:right="680" w:bottom="680" w:left="680" w:header="0" w:footer="720" w:gutter="0"/>
       <w:cols w:space="720"/>
@@ -2403,6 +3093,210 @@
 </file>
 
 <file path=word/header1.xml><?xml version="1.0" encoding="utf-8"?>
+<w:hdr xmlns:m="http://schemas.openxmlformats.org/officeDocument/2006/math" xmlns:mc="http://schemas.openxmlformats.org/markup-compatibility/2006" xmlns:mo="http://schemas.microsoft.com/office/mac/office/2008/main" xmlns:mv="urn:schemas-microsoft-com:mac:vml" xmlns:o="urn:schemas-microsoft-com:office:office" xmlns:r="http://schemas.openxmlformats.org/officeDocument/2006/relationships" xmlns:v="urn:schemas-microsoft-com:vml" xmlns:w10="urn:schemas-microsoft-com:office:word" xmlns:w14="http://schemas.microsoft.com/office/word/2010/wordml" xmlns:w="http://schemas.openxmlformats.org/wordprocessingml/2006/main" xmlns:wne="http://schemas.microsoft.com/office/word/2006/wordml" xmlns:wp14="http://schemas.microsoft.com/office/word/2010/wordprocessingDrawing" xmlns:wp="http://schemas.openxmlformats.org/drawingml/2006/wordprocessingDrawing" xmlns:wpc="http://schemas.microsoft.com/office/word/2010/wordprocessingCanvas" xmlns:wpg="http://schemas.microsoft.com/office/word/2010/wordprocessingGroup" xmlns:wpi="http://schemas.microsoft.com/office/word/2010/wordprocessingInk" xmlns:wps="http://schemas.microsoft.com/office/word/2010/wordprocessingShape" mc:Ignorable="w14 wp14">
+  <w:p>
+    <w:pPr>
+      <w:pStyle w:val="Header"/>
+    </w:pPr>
+    <w:r>
+      <w:drawing>
+        <wp:anchor distT="0" distB="0" distL="0" distR="0" simplePos="0" relativeHeight="0" behindDoc="1" locked="1" layoutInCell="1" allowOverlap="1">
+          <wp:simplePos x="0" y="0"/>
+          <wp:positionH relativeFrom="page">
+            <wp:posOffset>0</wp:posOffset>
+          </wp:positionH>
+          <wp:positionV relativeFrom="page">
+            <wp:posOffset>0</wp:posOffset>
+          </wp:positionV>
+          <wp:extent cx="7560000" cy="10692000"/>
+          <wp:effectExtent l="0" t="0" r="0" b="0"/>
+          <wp:wrapNone/>
+          <wp:docPr id="1" name="Picture 1"/>
+          <wp:cNvGraphicFramePr/>
+          <a:graphic xmlns:a="http://schemas.openxmlformats.org/drawingml/2006/main" xmlns:pic="http://schemas.openxmlformats.org/drawingml/2006/picture">
+            <a:graphicData uri="http://schemas.openxmlformats.org/drawingml/2006/picture">
+              <pic:pic>
+                <pic:nvPicPr>
+                  <pic:cNvPr id="0" name="ffffff.png"/>
+                  <pic:cNvPicPr/>
+                </pic:nvPicPr>
+                <pic:blipFill>
+                  <a:blip r:embed="rId1"/>
+                  <a:stretch>
+                    <a:fillRect/>
+                  </a:stretch>
+                </pic:blipFill>
+                <pic:spPr>
+                  <a:xfrm>
+                    <a:off x="0" y="0"/>
+                    <a:ext cx="7560000" cy="10692000"/>
+                  </a:xfrm>
+                  <a:prstGeom prst="rect"/>
+                </pic:spPr>
+              </pic:pic>
+            </a:graphicData>
+          </a:graphic>
+        </wp:anchor>
+      </w:drawing>
+    </w:r>
+  </w:p>
+</w:hdr>
+</file>
+
+<file path=word/header10.xml><?xml version="1.0" encoding="utf-8"?>
+<w:hdr xmlns:m="http://schemas.openxmlformats.org/officeDocument/2006/math" xmlns:mc="http://schemas.openxmlformats.org/markup-compatibility/2006" xmlns:mo="http://schemas.microsoft.com/office/mac/office/2008/main" xmlns:mv="urn:schemas-microsoft-com:mac:vml" xmlns:o="urn:schemas-microsoft-com:office:office" xmlns:r="http://schemas.openxmlformats.org/officeDocument/2006/relationships" xmlns:v="urn:schemas-microsoft-com:vml" xmlns:w10="urn:schemas-microsoft-com:office:word" xmlns:w14="http://schemas.microsoft.com/office/word/2010/wordml" xmlns:w="http://schemas.openxmlformats.org/wordprocessingml/2006/main" xmlns:wne="http://schemas.microsoft.com/office/word/2006/wordml" xmlns:wp14="http://schemas.microsoft.com/office/word/2010/wordprocessingDrawing" xmlns:wp="http://schemas.openxmlformats.org/drawingml/2006/wordprocessingDrawing" xmlns:wpc="http://schemas.microsoft.com/office/word/2010/wordprocessingCanvas" xmlns:wpg="http://schemas.microsoft.com/office/word/2010/wordprocessingGroup" xmlns:wpi="http://schemas.microsoft.com/office/word/2010/wordprocessingInk" xmlns:wps="http://schemas.microsoft.com/office/word/2010/wordprocessingShape" mc:Ignorable="w14 wp14">
+  <w:p>
+    <w:pPr>
+      <w:pStyle w:val="Header"/>
+    </w:pPr>
+    <w:r>
+      <w:drawing>
+        <wp:anchor distT="0" distB="0" distL="0" distR="0" simplePos="0" relativeHeight="0" behindDoc="1" locked="1" layoutInCell="1" allowOverlap="1">
+          <wp:simplePos x="0" y="0"/>
+          <wp:positionH relativeFrom="page">
+            <wp:posOffset>0</wp:posOffset>
+          </wp:positionH>
+          <wp:positionV relativeFrom="page">
+            <wp:posOffset>0</wp:posOffset>
+          </wp:positionV>
+          <wp:extent cx="7560000" cy="10692000"/>
+          <wp:effectExtent l="0" t="0" r="0" b="0"/>
+          <wp:wrapNone/>
+          <wp:docPr id="1" name="Picture 1"/>
+          <wp:cNvGraphicFramePr/>
+          <a:graphic xmlns:a="http://schemas.openxmlformats.org/drawingml/2006/main" xmlns:pic="http://schemas.openxmlformats.org/drawingml/2006/picture">
+            <a:graphicData uri="http://schemas.openxmlformats.org/drawingml/2006/picture">
+              <pic:pic>
+                <pic:nvPicPr>
+                  <pic:cNvPr id="0" name="ffffff.png"/>
+                  <pic:cNvPicPr/>
+                </pic:nvPicPr>
+                <pic:blipFill>
+                  <a:blip r:embed="rId1"/>
+                  <a:stretch>
+                    <a:fillRect/>
+                  </a:stretch>
+                </pic:blipFill>
+                <pic:spPr>
+                  <a:xfrm>
+                    <a:off x="0" y="0"/>
+                    <a:ext cx="7560000" cy="10692000"/>
+                  </a:xfrm>
+                  <a:prstGeom prst="rect"/>
+                </pic:spPr>
+              </pic:pic>
+            </a:graphicData>
+          </a:graphic>
+        </wp:anchor>
+      </w:drawing>
+    </w:r>
+  </w:p>
+</w:hdr>
+</file>
+
+<file path=word/header11.xml><?xml version="1.0" encoding="utf-8"?>
+<w:hdr xmlns:m="http://schemas.openxmlformats.org/officeDocument/2006/math" xmlns:mc="http://schemas.openxmlformats.org/markup-compatibility/2006" xmlns:mo="http://schemas.microsoft.com/office/mac/office/2008/main" xmlns:mv="urn:schemas-microsoft-com:mac:vml" xmlns:o="urn:schemas-microsoft-com:office:office" xmlns:r="http://schemas.openxmlformats.org/officeDocument/2006/relationships" xmlns:v="urn:schemas-microsoft-com:vml" xmlns:w10="urn:schemas-microsoft-com:office:word" xmlns:w14="http://schemas.microsoft.com/office/word/2010/wordml" xmlns:w="http://schemas.openxmlformats.org/wordprocessingml/2006/main" xmlns:wne="http://schemas.microsoft.com/office/word/2006/wordml" xmlns:wp14="http://schemas.microsoft.com/office/word/2010/wordprocessingDrawing" xmlns:wp="http://schemas.openxmlformats.org/drawingml/2006/wordprocessingDrawing" xmlns:wpc="http://schemas.microsoft.com/office/word/2010/wordprocessingCanvas" xmlns:wpg="http://schemas.microsoft.com/office/word/2010/wordprocessingGroup" xmlns:wpi="http://schemas.microsoft.com/office/word/2010/wordprocessingInk" xmlns:wps="http://schemas.microsoft.com/office/word/2010/wordprocessingShape" mc:Ignorable="w14 wp14">
+  <w:p>
+    <w:pPr>
+      <w:pStyle w:val="Header"/>
+    </w:pPr>
+    <w:r>
+      <w:drawing>
+        <wp:anchor distT="0" distB="0" distL="0" distR="0" simplePos="0" relativeHeight="0" behindDoc="1" locked="1" layoutInCell="1" allowOverlap="1">
+          <wp:simplePos x="0" y="0"/>
+          <wp:positionH relativeFrom="page">
+            <wp:posOffset>0</wp:posOffset>
+          </wp:positionH>
+          <wp:positionV relativeFrom="page">
+            <wp:posOffset>0</wp:posOffset>
+          </wp:positionV>
+          <wp:extent cx="7560000" cy="10692000"/>
+          <wp:effectExtent l="0" t="0" r="0" b="0"/>
+          <wp:wrapNone/>
+          <wp:docPr id="1" name="Picture 1"/>
+          <wp:cNvGraphicFramePr/>
+          <a:graphic xmlns:a="http://schemas.openxmlformats.org/drawingml/2006/main" xmlns:pic="http://schemas.openxmlformats.org/drawingml/2006/picture">
+            <a:graphicData uri="http://schemas.openxmlformats.org/drawingml/2006/picture">
+              <pic:pic>
+                <pic:nvPicPr>
+                  <pic:cNvPr id="0" name="ffffff.png"/>
+                  <pic:cNvPicPr/>
+                </pic:nvPicPr>
+                <pic:blipFill>
+                  <a:blip r:embed="rId1"/>
+                  <a:stretch>
+                    <a:fillRect/>
+                  </a:stretch>
+                </pic:blipFill>
+                <pic:spPr>
+                  <a:xfrm>
+                    <a:off x="0" y="0"/>
+                    <a:ext cx="7560000" cy="10692000"/>
+                  </a:xfrm>
+                  <a:prstGeom prst="rect"/>
+                </pic:spPr>
+              </pic:pic>
+            </a:graphicData>
+          </a:graphic>
+        </wp:anchor>
+      </w:drawing>
+    </w:r>
+  </w:p>
+</w:hdr>
+</file>
+
+<file path=word/header12.xml><?xml version="1.0" encoding="utf-8"?>
+<w:hdr xmlns:m="http://schemas.openxmlformats.org/officeDocument/2006/math" xmlns:mc="http://schemas.openxmlformats.org/markup-compatibility/2006" xmlns:mo="http://schemas.microsoft.com/office/mac/office/2008/main" xmlns:mv="urn:schemas-microsoft-com:mac:vml" xmlns:o="urn:schemas-microsoft-com:office:office" xmlns:r="http://schemas.openxmlformats.org/officeDocument/2006/relationships" xmlns:v="urn:schemas-microsoft-com:vml" xmlns:w10="urn:schemas-microsoft-com:office:word" xmlns:w14="http://schemas.microsoft.com/office/word/2010/wordml" xmlns:w="http://schemas.openxmlformats.org/wordprocessingml/2006/main" xmlns:wne="http://schemas.microsoft.com/office/word/2006/wordml" xmlns:wp14="http://schemas.microsoft.com/office/word/2010/wordprocessingDrawing" xmlns:wp="http://schemas.openxmlformats.org/drawingml/2006/wordprocessingDrawing" xmlns:wpc="http://schemas.microsoft.com/office/word/2010/wordprocessingCanvas" xmlns:wpg="http://schemas.microsoft.com/office/word/2010/wordprocessingGroup" xmlns:wpi="http://schemas.microsoft.com/office/word/2010/wordprocessingInk" xmlns:wps="http://schemas.microsoft.com/office/word/2010/wordprocessingShape" mc:Ignorable="w14 wp14">
+  <w:p>
+    <w:pPr>
+      <w:pStyle w:val="Header"/>
+    </w:pPr>
+    <w:r>
+      <w:drawing>
+        <wp:anchor distT="0" distB="0" distL="0" distR="0" simplePos="0" relativeHeight="0" behindDoc="1" locked="1" layoutInCell="1" allowOverlap="1">
+          <wp:simplePos x="0" y="0"/>
+          <wp:positionH relativeFrom="page">
+            <wp:posOffset>0</wp:posOffset>
+          </wp:positionH>
+          <wp:positionV relativeFrom="page">
+            <wp:posOffset>0</wp:posOffset>
+          </wp:positionV>
+          <wp:extent cx="7560000" cy="10692000"/>
+          <wp:effectExtent l="0" t="0" r="0" b="0"/>
+          <wp:wrapNone/>
+          <wp:docPr id="1" name="Picture 1"/>
+          <wp:cNvGraphicFramePr/>
+          <a:graphic xmlns:a="http://schemas.openxmlformats.org/drawingml/2006/main" xmlns:pic="http://schemas.openxmlformats.org/drawingml/2006/picture">
+            <a:graphicData uri="http://schemas.openxmlformats.org/drawingml/2006/picture">
+              <pic:pic>
+                <pic:nvPicPr>
+                  <pic:cNvPr id="0" name="ffffff.png"/>
+                  <pic:cNvPicPr/>
+                </pic:nvPicPr>
+                <pic:blipFill>
+                  <a:blip r:embed="rId1"/>
+                  <a:stretch>
+                    <a:fillRect/>
+                  </a:stretch>
+                </pic:blipFill>
+                <pic:spPr>
+                  <a:xfrm>
+                    <a:off x="0" y="0"/>
+                    <a:ext cx="7560000" cy="10692000"/>
+                  </a:xfrm>
+                  <a:prstGeom prst="rect"/>
+                </pic:spPr>
+              </pic:pic>
+            </a:graphicData>
+          </a:graphic>
+        </wp:anchor>
+      </w:drawing>
+    </w:r>
+  </w:p>
+</w:hdr>
+</file>
+
+<file path=word/header13.xml><?xml version="1.0" encoding="utf-8"?>
 <w:hdr xmlns:m="http://schemas.openxmlformats.org/officeDocument/2006/math" xmlns:mc="http://schemas.openxmlformats.org/markup-compatibility/2006" xmlns:mo="http://schemas.microsoft.com/office/mac/office/2008/main" xmlns:mv="urn:schemas-microsoft-com:mac:vml" xmlns:o="urn:schemas-microsoft-com:office:office" xmlns:r="http://schemas.openxmlformats.org/officeDocument/2006/relationships" xmlns:v="urn:schemas-microsoft-com:vml" xmlns:w10="urn:schemas-microsoft-com:office:word" xmlns:w14="http://schemas.microsoft.com/office/word/2010/wordml" xmlns:w="http://schemas.openxmlformats.org/wordprocessingml/2006/main" xmlns:wne="http://schemas.microsoft.com/office/word/2006/wordml" xmlns:wp14="http://schemas.microsoft.com/office/word/2010/wordprocessingDrawing" xmlns:wp="http://schemas.openxmlformats.org/drawingml/2006/wordprocessingDrawing" xmlns:wpc="http://schemas.microsoft.com/office/word/2010/wordprocessingCanvas" xmlns:wpg="http://schemas.microsoft.com/office/word/2010/wordprocessingGroup" xmlns:wpi="http://schemas.microsoft.com/office/word/2010/wordprocessingInk" xmlns:wps="http://schemas.microsoft.com/office/word/2010/wordprocessingShape" mc:Ignorable="w14 wp14">
   <w:p>
     <w:pPr>
@@ -2478,7 +3372,7 @@
             <a:graphicData uri="http://schemas.openxmlformats.org/drawingml/2006/picture">
               <pic:pic>
                 <pic:nvPicPr>
-                  <pic:cNvPr id="0" name="f3f3f3.png"/>
+                  <pic:cNvPr id="0" name="ffffff.png"/>
                   <pic:cNvPicPr/>
                 </pic:nvPicPr>
                 <pic:blipFill>
@@ -2529,7 +3423,7 @@
             <a:graphicData uri="http://schemas.openxmlformats.org/drawingml/2006/picture">
               <pic:pic>
                 <pic:nvPicPr>
-                  <pic:cNvPr id="0" name="e6e6e6.png"/>
+                  <pic:cNvPr id="0" name="ffffff.png"/>
                   <pic:cNvPicPr/>
                 </pic:nvPicPr>
                 <pic:blipFill>
@@ -2580,7 +3474,7 @@
             <a:graphicData uri="http://schemas.openxmlformats.org/drawingml/2006/picture">
               <pic:pic>
                 <pic:nvPicPr>
-                  <pic:cNvPr id="0" name="dddddd.png"/>
+                  <pic:cNvPr id="0" name="ffffff.png"/>
                   <pic:cNvPicPr/>
                 </pic:nvPicPr>
                 <pic:blipFill>
@@ -2631,7 +3525,7 @@
             <a:graphicData uri="http://schemas.openxmlformats.org/drawingml/2006/picture">
               <pic:pic>
                 <pic:nvPicPr>
-                  <pic:cNvPr id="0" name="3e3e3e.png"/>
+                  <pic:cNvPr id="0" name="ffffff.png"/>
                   <pic:cNvPicPr/>
                 </pic:nvPicPr>
                 <pic:blipFill>
@@ -2682,7 +3576,7 @@
             <a:graphicData uri="http://schemas.openxmlformats.org/drawingml/2006/picture">
               <pic:pic>
                 <pic:nvPicPr>
-                  <pic:cNvPr id="0" name="2e2e2e.png"/>
+                  <pic:cNvPr id="0" name="ffffff.png"/>
                   <pic:cNvPicPr/>
                 </pic:nvPicPr>
                 <pic:blipFill>
@@ -2733,7 +3627,7 @@
             <a:graphicData uri="http://schemas.openxmlformats.org/drawingml/2006/picture">
               <pic:pic>
                 <pic:nvPicPr>
-                  <pic:cNvPr id="0" name="1f1f1f.png"/>
+                  <pic:cNvPr id="0" name="ffffff.png"/>
                   <pic:cNvPicPr/>
                 </pic:nvPicPr>
                 <pic:blipFill>
@@ -2784,7 +3678,58 @@
             <a:graphicData uri="http://schemas.openxmlformats.org/drawingml/2006/picture">
               <pic:pic>
                 <pic:nvPicPr>
-                  <pic:cNvPr id="0" name="131313.png"/>
+                  <pic:cNvPr id="0" name="ffffff.png"/>
+                  <pic:cNvPicPr/>
+                </pic:nvPicPr>
+                <pic:blipFill>
+                  <a:blip r:embed="rId1"/>
+                  <a:stretch>
+                    <a:fillRect/>
+                  </a:stretch>
+                </pic:blipFill>
+                <pic:spPr>
+                  <a:xfrm>
+                    <a:off x="0" y="0"/>
+                    <a:ext cx="7560000" cy="10692000"/>
+                  </a:xfrm>
+                  <a:prstGeom prst="rect"/>
+                </pic:spPr>
+              </pic:pic>
+            </a:graphicData>
+          </a:graphic>
+        </wp:anchor>
+      </w:drawing>
+    </w:r>
+  </w:p>
+</w:hdr>
+</file>
+
+<file path=word/header9.xml><?xml version="1.0" encoding="utf-8"?>
+<w:hdr xmlns:m="http://schemas.openxmlformats.org/officeDocument/2006/math" xmlns:mc="http://schemas.openxmlformats.org/markup-compatibility/2006" xmlns:mo="http://schemas.microsoft.com/office/mac/office/2008/main" xmlns:mv="urn:schemas-microsoft-com:mac:vml" xmlns:o="urn:schemas-microsoft-com:office:office" xmlns:r="http://schemas.openxmlformats.org/officeDocument/2006/relationships" xmlns:v="urn:schemas-microsoft-com:vml" xmlns:w10="urn:schemas-microsoft-com:office:word" xmlns:w14="http://schemas.microsoft.com/office/word/2010/wordml" xmlns:w="http://schemas.openxmlformats.org/wordprocessingml/2006/main" xmlns:wne="http://schemas.microsoft.com/office/word/2006/wordml" xmlns:wp14="http://schemas.microsoft.com/office/word/2010/wordprocessingDrawing" xmlns:wp="http://schemas.openxmlformats.org/drawingml/2006/wordprocessingDrawing" xmlns:wpc="http://schemas.microsoft.com/office/word/2010/wordprocessingCanvas" xmlns:wpg="http://schemas.microsoft.com/office/word/2010/wordprocessingGroup" xmlns:wpi="http://schemas.microsoft.com/office/word/2010/wordprocessingInk" xmlns:wps="http://schemas.microsoft.com/office/word/2010/wordprocessingShape" mc:Ignorable="w14 wp14">
+  <w:p>
+    <w:pPr>
+      <w:pStyle w:val="Header"/>
+    </w:pPr>
+    <w:r>
+      <w:drawing>
+        <wp:anchor distT="0" distB="0" distL="0" distR="0" simplePos="0" relativeHeight="0" behindDoc="1" locked="1" layoutInCell="1" allowOverlap="1">
+          <wp:simplePos x="0" y="0"/>
+          <wp:positionH relativeFrom="page">
+            <wp:posOffset>0</wp:posOffset>
+          </wp:positionH>
+          <wp:positionV relativeFrom="page">
+            <wp:posOffset>0</wp:posOffset>
+          </wp:positionV>
+          <wp:extent cx="7560000" cy="10692000"/>
+          <wp:effectExtent l="0" t="0" r="0" b="0"/>
+          <wp:wrapNone/>
+          <wp:docPr id="1" name="Picture 1"/>
+          <wp:cNvGraphicFramePr/>
+          <a:graphic xmlns:a="http://schemas.openxmlformats.org/drawingml/2006/main" xmlns:pic="http://schemas.openxmlformats.org/drawingml/2006/picture">
+            <a:graphicData uri="http://schemas.openxmlformats.org/drawingml/2006/picture">
+              <pic:pic>
+                <pic:nvPicPr>
+                  <pic:cNvPr id="0" name="ffffff.png"/>
                   <pic:cNvPicPr/>
                 </pic:nvPicPr>
                 <pic:blipFill>

</xml_diff>